<commit_message>
docs: actualiza las figuras y el capítulo de pruebas con el tema claro (corrida 8)
</commit_message>
<xml_diff>
--- a/docs/pruebas/Capitulo_Pruebas.docx
+++ b/docs/pruebas/Capitulo_Pruebas.docx
@@ -19,7 +19,13 @@
         <w:rPr>
           <w:color w:val="595959"/>
         </w:rPr>
-        <w:t>Seipo — Sistema de venta e inventario. Pruebas automatizadas de caja negra ejecutadas el 19/10/2026 (corridas 1 a 5) y el 29/10/2026 (corridas 6 y 7).</w:t>
+        <w:t xml:space="preserve">Seipo — Sistema de venta e inventario. Pruebas automatizadas de caja negra ejecutadas el 19/10/2026 (corridas 1 a 5) y el 29/10/2026 </w:t>
+      </w:r>
+      <w:r>
+        <w:rPr>
+          <w:color w:val="595959"/>
+        </w:rPr>
+        <w:t>(corridas 6 a 8).</w:t>
       </w:r>
     </w:p>
     <w:p>
@@ -161,12 +167,6 @@
         <w:gridCol w:w="7028"/>
       </w:tblGrid>
       <w:tr>
-        <w:tblPrEx>
-          <w:tblCellMar>
-            <w:top w:w="0" w:type="dxa"/>
-            <w:bottom w:w="0" w:type="dxa"/>
-          </w:tblCellMar>
-        </w:tblPrEx>
         <w:trPr>
           <w:cantSplit/>
           <w:tblHeader/>
@@ -227,12 +227,6 @@
         </w:tc>
       </w:tr>
       <w:tr>
-        <w:tblPrEx>
-          <w:tblCellMar>
-            <w:top w:w="0" w:type="dxa"/>
-            <w:bottom w:w="0" w:type="dxa"/>
-          </w:tblCellMar>
-        </w:tblPrEx>
         <w:trPr>
           <w:cantSplit/>
         </w:trPr>
@@ -288,12 +282,6 @@
         </w:tc>
       </w:tr>
       <w:tr>
-        <w:tblPrEx>
-          <w:tblCellMar>
-            <w:top w:w="0" w:type="dxa"/>
-            <w:bottom w:w="0" w:type="dxa"/>
-          </w:tblCellMar>
-        </w:tblPrEx>
         <w:trPr>
           <w:cantSplit/>
         </w:trPr>
@@ -351,12 +339,6 @@
         </w:tc>
       </w:tr>
       <w:tr>
-        <w:tblPrEx>
-          <w:tblCellMar>
-            <w:top w:w="0" w:type="dxa"/>
-            <w:bottom w:w="0" w:type="dxa"/>
-          </w:tblCellMar>
-        </w:tblPrEx>
         <w:trPr>
           <w:cantSplit/>
         </w:trPr>
@@ -412,12 +394,6 @@
         </w:tc>
       </w:tr>
       <w:tr>
-        <w:tblPrEx>
-          <w:tblCellMar>
-            <w:top w:w="0" w:type="dxa"/>
-            <w:bottom w:w="0" w:type="dxa"/>
-          </w:tblCellMar>
-        </w:tblPrEx>
         <w:trPr>
           <w:cantSplit/>
         </w:trPr>
@@ -475,12 +451,6 @@
         </w:tc>
       </w:tr>
       <w:tr>
-        <w:tblPrEx>
-          <w:tblCellMar>
-            <w:top w:w="0" w:type="dxa"/>
-            <w:bottom w:w="0" w:type="dxa"/>
-          </w:tblCellMar>
-        </w:tblPrEx>
         <w:trPr>
           <w:cantSplit/>
         </w:trPr>
@@ -550,7 +520,10 @@
         <w:jc w:val="both"/>
       </w:pPr>
       <w:r>
-        <w:t>Resultado final de cada caso (corrida 7)</w:t>
+        <w:t xml:space="preserve">Resultado final de cada caso </w:t>
+      </w:r>
+      <w:r>
+        <w:t>(corrida 8)</w:t>
       </w:r>
       <w:r>
         <w:t>.</w:t>
@@ -583,12 +556,6 @@
         <w:gridCol w:w="905"/>
       </w:tblGrid>
       <w:tr>
-        <w:tblPrEx>
-          <w:tblCellMar>
-            <w:top w:w="0" w:type="dxa"/>
-            <w:bottom w:w="0" w:type="dxa"/>
-          </w:tblCellMar>
-        </w:tblPrEx>
         <w:trPr>
           <w:cantSplit/>
           <w:tblHeader/>
@@ -757,12 +724,6 @@
         </w:tc>
       </w:tr>
       <w:tr>
-        <w:tblPrEx>
-          <w:tblCellMar>
-            <w:top w:w="0" w:type="dxa"/>
-            <w:bottom w:w="0" w:type="dxa"/>
-          </w:tblCellMar>
-        </w:tblPrEx>
         <w:trPr>
           <w:cantSplit/>
         </w:trPr>
@@ -918,12 +879,6 @@
         </w:tc>
       </w:tr>
       <w:tr>
-        <w:tblPrEx>
-          <w:tblCellMar>
-            <w:top w:w="0" w:type="dxa"/>
-            <w:bottom w:w="0" w:type="dxa"/>
-          </w:tblCellMar>
-        </w:tblPrEx>
         <w:trPr>
           <w:cantSplit/>
         </w:trPr>
@@ -1085,12 +1040,6 @@
         </w:tc>
       </w:tr>
       <w:tr>
-        <w:tblPrEx>
-          <w:tblCellMar>
-            <w:top w:w="0" w:type="dxa"/>
-            <w:bottom w:w="0" w:type="dxa"/>
-          </w:tblCellMar>
-        </w:tblPrEx>
         <w:trPr>
           <w:cantSplit/>
         </w:trPr>
@@ -1246,12 +1195,6 @@
         </w:tc>
       </w:tr>
       <w:tr>
-        <w:tblPrEx>
-          <w:tblCellMar>
-            <w:top w:w="0" w:type="dxa"/>
-            <w:bottom w:w="0" w:type="dxa"/>
-          </w:tblCellMar>
-        </w:tblPrEx>
         <w:trPr>
           <w:cantSplit/>
         </w:trPr>
@@ -1412,12 +1355,6 @@
         </w:tc>
       </w:tr>
       <w:tr>
-        <w:tblPrEx>
-          <w:tblCellMar>
-            <w:top w:w="0" w:type="dxa"/>
-            <w:bottom w:w="0" w:type="dxa"/>
-          </w:tblCellMar>
-        </w:tblPrEx>
         <w:trPr>
           <w:cantSplit/>
         </w:trPr>
@@ -1573,12 +1510,6 @@
         </w:tc>
       </w:tr>
       <w:tr>
-        <w:tblPrEx>
-          <w:tblCellMar>
-            <w:top w:w="0" w:type="dxa"/>
-            <w:bottom w:w="0" w:type="dxa"/>
-          </w:tblCellMar>
-        </w:tblPrEx>
         <w:trPr>
           <w:cantSplit/>
         </w:trPr>
@@ -1739,12 +1670,6 @@
         </w:tc>
       </w:tr>
       <w:tr>
-        <w:tblPrEx>
-          <w:tblCellMar>
-            <w:top w:w="0" w:type="dxa"/>
-            <w:bottom w:w="0" w:type="dxa"/>
-          </w:tblCellMar>
-        </w:tblPrEx>
         <w:trPr>
           <w:cantSplit/>
         </w:trPr>
@@ -1900,12 +1825,6 @@
         </w:tc>
       </w:tr>
       <w:tr>
-        <w:tblPrEx>
-          <w:tblCellMar>
-            <w:top w:w="0" w:type="dxa"/>
-            <w:bottom w:w="0" w:type="dxa"/>
-          </w:tblCellMar>
-        </w:tblPrEx>
         <w:trPr>
           <w:cantSplit/>
         </w:trPr>
@@ -2066,12 +1985,6 @@
         </w:tc>
       </w:tr>
       <w:tr>
-        <w:tblPrEx>
-          <w:tblCellMar>
-            <w:top w:w="0" w:type="dxa"/>
-            <w:bottom w:w="0" w:type="dxa"/>
-          </w:tblCellMar>
-        </w:tblPrEx>
         <w:trPr>
           <w:cantSplit/>
         </w:trPr>
@@ -2227,12 +2140,6 @@
         </w:tc>
       </w:tr>
       <w:tr>
-        <w:tblPrEx>
-          <w:tblCellMar>
-            <w:top w:w="0" w:type="dxa"/>
-            <w:bottom w:w="0" w:type="dxa"/>
-          </w:tblCellMar>
-        </w:tblPrEx>
         <w:trPr>
           <w:cantSplit/>
         </w:trPr>
@@ -2393,12 +2300,6 @@
         </w:tc>
       </w:tr>
       <w:tr>
-        <w:tblPrEx>
-          <w:tblCellMar>
-            <w:top w:w="0" w:type="dxa"/>
-            <w:bottom w:w="0" w:type="dxa"/>
-          </w:tblCellMar>
-        </w:tblPrEx>
         <w:trPr>
           <w:cantSplit/>
         </w:trPr>
@@ -2554,12 +2455,6 @@
         </w:tc>
       </w:tr>
       <w:tr>
-        <w:tblPrEx>
-          <w:tblCellMar>
-            <w:top w:w="0" w:type="dxa"/>
-            <w:bottom w:w="0" w:type="dxa"/>
-          </w:tblCellMar>
-        </w:tblPrEx>
         <w:trPr>
           <w:cantSplit/>
         </w:trPr>
@@ -2720,12 +2615,6 @@
         </w:tc>
       </w:tr>
       <w:tr>
-        <w:tblPrEx>
-          <w:tblCellMar>
-            <w:top w:w="0" w:type="dxa"/>
-            <w:bottom w:w="0" w:type="dxa"/>
-          </w:tblCellMar>
-        </w:tblPrEx>
         <w:trPr>
           <w:cantSplit/>
         </w:trPr>
@@ -2881,12 +2770,6 @@
         </w:tc>
       </w:tr>
       <w:tr>
-        <w:tblPrEx>
-          <w:tblCellMar>
-            <w:top w:w="0" w:type="dxa"/>
-            <w:bottom w:w="0" w:type="dxa"/>
-          </w:tblCellMar>
-        </w:tblPrEx>
         <w:trPr>
           <w:cantSplit/>
         </w:trPr>
@@ -3048,12 +2931,6 @@
         </w:tc>
       </w:tr>
       <w:tr>
-        <w:tblPrEx>
-          <w:tblCellMar>
-            <w:top w:w="0" w:type="dxa"/>
-            <w:bottom w:w="0" w:type="dxa"/>
-          </w:tblCellMar>
-        </w:tblPrEx>
         <w:trPr>
           <w:cantSplit/>
         </w:trPr>
@@ -3294,12 +3171,6 @@
         <w:gridCol w:w="4721"/>
       </w:tblGrid>
       <w:tr>
-        <w:tblPrEx>
-          <w:tblCellMar>
-            <w:top w:w="0" w:type="dxa"/>
-            <w:bottom w:w="0" w:type="dxa"/>
-          </w:tblCellMar>
-        </w:tblPrEx>
         <w:trPr>
           <w:cantSplit/>
           <w:tblHeader/>
@@ -3441,12 +3312,6 @@
         </w:tc>
       </w:tr>
       <w:tr>
-        <w:tblPrEx>
-          <w:tblCellMar>
-            <w:top w:w="0" w:type="dxa"/>
-            <w:bottom w:w="0" w:type="dxa"/>
-          </w:tblCellMar>
-        </w:tblPrEx>
         <w:trPr>
           <w:cantSplit/>
         </w:trPr>
@@ -3574,12 +3439,6 @@
         </w:tc>
       </w:tr>
       <w:tr>
-        <w:tblPrEx>
-          <w:tblCellMar>
-            <w:top w:w="0" w:type="dxa"/>
-            <w:bottom w:w="0" w:type="dxa"/>
-          </w:tblCellMar>
-        </w:tblPrEx>
         <w:trPr>
           <w:cantSplit/>
         </w:trPr>
@@ -3712,12 +3571,6 @@
         </w:tc>
       </w:tr>
       <w:tr>
-        <w:tblPrEx>
-          <w:tblCellMar>
-            <w:top w:w="0" w:type="dxa"/>
-            <w:bottom w:w="0" w:type="dxa"/>
-          </w:tblCellMar>
-        </w:tblPrEx>
         <w:trPr>
           <w:cantSplit/>
         </w:trPr>
@@ -3845,12 +3698,6 @@
         </w:tc>
       </w:tr>
       <w:tr>
-        <w:tblPrEx>
-          <w:tblCellMar>
-            <w:top w:w="0" w:type="dxa"/>
-            <w:bottom w:w="0" w:type="dxa"/>
-          </w:tblCellMar>
-        </w:tblPrEx>
         <w:trPr>
           <w:cantSplit/>
         </w:trPr>
@@ -3983,12 +3830,6 @@
         </w:tc>
       </w:tr>
       <w:tr>
-        <w:tblPrEx>
-          <w:tblCellMar>
-            <w:top w:w="0" w:type="dxa"/>
-            <w:bottom w:w="0" w:type="dxa"/>
-          </w:tblCellMar>
-        </w:tblPrEx>
         <w:trPr>
           <w:cantSplit/>
         </w:trPr>
@@ -4131,12 +3972,6 @@
         </w:tc>
       </w:tr>
       <w:tr>
-        <w:tblPrEx>
-          <w:tblCellMar>
-            <w:top w:w="0" w:type="dxa"/>
-            <w:bottom w:w="0" w:type="dxa"/>
-          </w:tblCellMar>
-        </w:tblPrEx>
         <w:trPr>
           <w:cantSplit/>
         </w:trPr>
@@ -4306,18 +4141,15 @@
         </w:tc>
       </w:tr>
       <w:tr>
-        <w:tblPrEx>
-          <w:tblCellMar>
-            <w:top w:w="0" w:type="dxa"/>
-            <w:bottom w:w="0" w:type="dxa"/>
-          </w:tblCellMar>
-        </w:tblPrEx>
         <w:trPr>
           <w:cantSplit/>
         </w:trPr>
         <w:tc>
           <w:tcPr>
             <w:tcW w:w="1204" w:type="dxa"/>
+            <w:tcBorders>
+              <w:bottom w:val="single" w:sz="4" w:space="0" w:color="808080"/>
+            </w:tcBorders>
             <w:shd w:val="clear" w:color="auto" w:fill="auto"/>
             <w:tcMar>
               <w:top w:w="60" w:type="dxa"/>
@@ -4351,6 +4183,9 @@
         <w:tc>
           <w:tcPr>
             <w:tcW w:w="1405" w:type="dxa"/>
+            <w:tcBorders>
+              <w:bottom w:val="single" w:sz="4" w:space="0" w:color="808080"/>
+            </w:tcBorders>
             <w:shd w:val="clear" w:color="auto" w:fill="auto"/>
             <w:tcMar>
               <w:top w:w="60" w:type="dxa"/>
@@ -4380,6 +4215,9 @@
         <w:tc>
           <w:tcPr>
             <w:tcW w:w="1305" w:type="dxa"/>
+            <w:tcBorders>
+              <w:bottom w:val="single" w:sz="4" w:space="0" w:color="808080"/>
+            </w:tcBorders>
             <w:shd w:val="clear" w:color="auto" w:fill="auto"/>
             <w:tcMar>
               <w:top w:w="60" w:type="dxa"/>
@@ -4409,6 +4247,9 @@
         <w:tc>
           <w:tcPr>
             <w:tcW w:w="1405" w:type="dxa"/>
+            <w:tcBorders>
+              <w:bottom w:val="single" w:sz="4" w:space="0" w:color="808080"/>
+            </w:tcBorders>
             <w:shd w:val="clear" w:color="auto" w:fill="auto"/>
             <w:tcMar>
               <w:top w:w="60" w:type="dxa"/>
@@ -4438,6 +4279,9 @@
         <w:tc>
           <w:tcPr>
             <w:tcW w:w="4721" w:type="dxa"/>
+            <w:tcBorders>
+              <w:bottom w:val="single" w:sz="4" w:space="0" w:color="808080"/>
+            </w:tcBorders>
             <w:shd w:val="clear" w:color="auto" w:fill="auto"/>
             <w:tcMar>
               <w:top w:w="60" w:type="dxa"/>
@@ -4461,6 +4305,160 @@
                 <w:szCs w:val="20"/>
               </w:rPr>
               <w:t>Repetición de la corrida 6 sin cambios en el código ni en las pruebas</w:t>
+            </w:r>
+          </w:p>
+        </w:tc>
+      </w:tr>
+      <w:tr>
+        <w:trPr>
+          <w:cantSplit/>
+        </w:trPr>
+        <w:tc>
+          <w:tcPr>
+            <w:tcW w:w="1204" w:type="dxa"/>
+            <w:shd w:val="clear" w:color="auto" w:fill="F2F2F2"/>
+            <w:tcMar>
+              <w:top w:w="60" w:type="dxa"/>
+              <w:left w:w="80" w:type="dxa"/>
+              <w:bottom w:w="60" w:type="dxa"/>
+              <w:right w:w="80" w:type="dxa"/>
+            </w:tcMar>
+            <w:vAlign w:val="center"/>
+          </w:tcPr>
+          <w:p>
+            <w:pPr>
+              <w:spacing w:after="0" w:line="240" w:lineRule="auto"/>
+              <w:rPr>
+                <w:b/>
+                <w:bCs/>
+                <w:sz w:val="20"/>
+                <w:szCs w:val="20"/>
+              </w:rPr>
+            </w:pPr>
+            <w:r>
+              <w:rPr>
+                <w:b/>
+                <w:bCs/>
+                <w:sz w:val="20"/>
+                <w:szCs w:val="20"/>
+              </w:rPr>
+              <w:t>Corrida 8</w:t>
+            </w:r>
+          </w:p>
+        </w:tc>
+        <w:tc>
+          <w:tcPr>
+            <w:tcW w:w="1405" w:type="dxa"/>
+            <w:shd w:val="clear" w:color="auto" w:fill="F2F2F2"/>
+            <w:tcMar>
+              <w:top w:w="60" w:type="dxa"/>
+              <w:left w:w="80" w:type="dxa"/>
+              <w:bottom w:w="60" w:type="dxa"/>
+              <w:right w:w="80" w:type="dxa"/>
+            </w:tcMar>
+            <w:vAlign w:val="center"/>
+          </w:tcPr>
+          <w:p>
+            <w:pPr>
+              <w:spacing w:after="0" w:line="240" w:lineRule="auto"/>
+              <w:rPr>
+                <w:sz w:val="20"/>
+                <w:szCs w:val="20"/>
+              </w:rPr>
+            </w:pPr>
+            <w:r>
+              <w:rPr>
+                <w:sz w:val="20"/>
+                <w:szCs w:val="20"/>
+              </w:rPr>
+              <w:t>15/15</w:t>
+            </w:r>
+          </w:p>
+        </w:tc>
+        <w:tc>
+          <w:tcPr>
+            <w:tcW w:w="1305" w:type="dxa"/>
+            <w:shd w:val="clear" w:color="auto" w:fill="F2F2F2"/>
+            <w:tcMar>
+              <w:top w:w="60" w:type="dxa"/>
+              <w:left w:w="80" w:type="dxa"/>
+              <w:bottom w:w="60" w:type="dxa"/>
+              <w:right w:w="80" w:type="dxa"/>
+            </w:tcMar>
+            <w:vAlign w:val="center"/>
+          </w:tcPr>
+          <w:p>
+            <w:pPr>
+              <w:spacing w:after="0" w:line="240" w:lineRule="auto"/>
+              <w:rPr>
+                <w:sz w:val="20"/>
+                <w:szCs w:val="20"/>
+              </w:rPr>
+            </w:pPr>
+            <w:r>
+              <w:rPr>
+                <w:sz w:val="20"/>
+                <w:szCs w:val="20"/>
+              </w:rPr>
+              <w:t>100 %</w:t>
+            </w:r>
+          </w:p>
+        </w:tc>
+        <w:tc>
+          <w:tcPr>
+            <w:tcW w:w="1405" w:type="dxa"/>
+            <w:shd w:val="clear" w:color="auto" w:fill="F2F2F2"/>
+            <w:tcMar>
+              <w:top w:w="60" w:type="dxa"/>
+              <w:left w:w="80" w:type="dxa"/>
+              <w:bottom w:w="60" w:type="dxa"/>
+              <w:right w:w="80" w:type="dxa"/>
+            </w:tcMar>
+            <w:vAlign w:val="center"/>
+          </w:tcPr>
+          <w:p>
+            <w:pPr>
+              <w:spacing w:after="0" w:line="240" w:lineRule="auto"/>
+              <w:rPr>
+                <w:sz w:val="20"/>
+                <w:szCs w:val="20"/>
+              </w:rPr>
+            </w:pPr>
+            <w:r>
+              <w:rPr>
+                <w:sz w:val="20"/>
+                <w:szCs w:val="20"/>
+              </w:rPr>
+              <w:t>Ninguno</w:t>
+            </w:r>
+          </w:p>
+        </w:tc>
+        <w:tc>
+          <w:tcPr>
+            <w:tcW w:w="4721" w:type="dxa"/>
+            <w:shd w:val="clear" w:color="auto" w:fill="F2F2F2"/>
+            <w:tcMar>
+              <w:top w:w="60" w:type="dxa"/>
+              <w:left w:w="80" w:type="dxa"/>
+              <w:bottom w:w="60" w:type="dxa"/>
+              <w:right w:w="80" w:type="dxa"/>
+            </w:tcMar>
+            <w:vAlign w:val="center"/>
+          </w:tcPr>
+          <w:p>
+            <w:pPr>
+              <w:spacing w:after="0" w:line="240" w:lineRule="auto"/>
+              <w:rPr>
+                <w:sz w:val="20"/>
+                <w:szCs w:val="20"/>
+              </w:rPr>
+            </w:pPr>
+            <w:r>
+              <w:rPr>
+                <w:sz w:val="20"/>
+                <w:szCs w:val="20"/>
+              </w:rPr>
+              <w:t>Regresión tras el cambio visual (tema claro con acento naranja, menú con iconos, tarjetas e insignias de estado). Solo cambió la capa de vista; ningún caso cambió</w:t>
             </w:r>
           </w:p>
         </w:tc>
@@ -4472,7 +4470,10 @@
         <w:jc w:val="both"/>
       </w:pPr>
       <w:r>
-        <w:t>Estado por corrida de los casos que cambiaron (los otros 12 casos pasaron en las siete corridas</w:t>
+        <w:t xml:space="preserve">Estado por corrida de los casos que cambiaron (los otros 12 casos </w:t>
+      </w:r>
+      <w:r>
+        <w:t>pasaron en las ocho corridas</w:t>
       </w:r>
       <w:r>
         <w:t>):</w:t>
@@ -4480,7 +4481,7 @@
     </w:p>
     <w:tbl>
       <w:tblPr>
-        <w:tblW w:w="10039" w:type="dxa"/>
+        <w:tblW w:w="10040" w:type="dxa"/>
         <w:tblBorders>
           <w:top w:val="single" w:sz="4" w:space="0" w:color="808080"/>
           <w:left w:val="single" w:sz="4" w:space="0" w:color="808080"/>
@@ -4497,29 +4498,24 @@
         <w:tblLook w:val="04A0" w:firstRow="1" w:lastRow="0" w:firstColumn="1" w:lastColumn="0" w:noHBand="0" w:noVBand="1"/>
       </w:tblPr>
       <w:tblGrid>
-        <w:gridCol w:w="2332"/>
-        <w:gridCol w:w="1101"/>
-        <w:gridCol w:w="1101"/>
-        <w:gridCol w:w="1101"/>
-        <w:gridCol w:w="1101"/>
-        <w:gridCol w:w="1101"/>
-        <w:gridCol w:w="1101"/>
-        <w:gridCol w:w="1101"/>
+        <w:gridCol w:w="2080"/>
+        <w:gridCol w:w="995"/>
+        <w:gridCol w:w="995"/>
+        <w:gridCol w:w="995"/>
+        <w:gridCol w:w="995"/>
+        <w:gridCol w:w="995"/>
+        <w:gridCol w:w="995"/>
+        <w:gridCol w:w="995"/>
+        <w:gridCol w:w="995"/>
       </w:tblGrid>
       <w:tr>
-        <w:tblPrEx>
-          <w:tblCellMar>
-            <w:top w:w="0" w:type="dxa"/>
-            <w:bottom w:w="0" w:type="dxa"/>
-          </w:tblCellMar>
-        </w:tblPrEx>
         <w:trPr>
           <w:cantSplit/>
           <w:tblHeader/>
         </w:trPr>
         <w:tc>
           <w:tcPr>
-            <w:tcW w:w="2332" w:type="dxa"/>
+            <w:tcW w:w="2080" w:type="dxa"/>
             <w:shd w:val="clear" w:color="auto" w:fill="D9D9D9"/>
             <w:tcMar>
               <w:top w:w="60" w:type="dxa"/>
@@ -4546,7 +4542,7 @@
         </w:tc>
         <w:tc>
           <w:tcPr>
-            <w:tcW w:w="1101" w:type="dxa"/>
+            <w:tcW w:w="995" w:type="dxa"/>
             <w:shd w:val="clear" w:color="auto" w:fill="D9D9D9"/>
             <w:tcMar>
               <w:top w:w="60" w:type="dxa"/>
@@ -4573,7 +4569,7 @@
         </w:tc>
         <w:tc>
           <w:tcPr>
-            <w:tcW w:w="1101" w:type="dxa"/>
+            <w:tcW w:w="995" w:type="dxa"/>
             <w:shd w:val="clear" w:color="auto" w:fill="D9D9D9"/>
             <w:tcMar>
               <w:top w:w="60" w:type="dxa"/>
@@ -4600,7 +4596,7 @@
         </w:tc>
         <w:tc>
           <w:tcPr>
-            <w:tcW w:w="1101" w:type="dxa"/>
+            <w:tcW w:w="995" w:type="dxa"/>
             <w:shd w:val="clear" w:color="auto" w:fill="D9D9D9"/>
             <w:tcMar>
               <w:top w:w="60" w:type="dxa"/>
@@ -4627,7 +4623,7 @@
         </w:tc>
         <w:tc>
           <w:tcPr>
-            <w:tcW w:w="1101" w:type="dxa"/>
+            <w:tcW w:w="995" w:type="dxa"/>
             <w:shd w:val="clear" w:color="auto" w:fill="D9D9D9"/>
             <w:tcMar>
               <w:top w:w="60" w:type="dxa"/>
@@ -4654,7 +4650,7 @@
         </w:tc>
         <w:tc>
           <w:tcPr>
-            <w:tcW w:w="1101" w:type="dxa"/>
+            <w:tcW w:w="995" w:type="dxa"/>
             <w:shd w:val="clear" w:color="auto" w:fill="D9D9D9"/>
             <w:tcMar>
               <w:top w:w="60" w:type="dxa"/>
@@ -4681,7 +4677,7 @@
         </w:tc>
         <w:tc>
           <w:tcPr>
-            <w:tcW w:w="1101" w:type="dxa"/>
+            <w:tcW w:w="995" w:type="dxa"/>
             <w:tcBorders>
               <w:bottom w:val="single" w:sz="4" w:space="0" w:color="808080"/>
             </w:tcBorders>
@@ -4717,7 +4713,7 @@
         </w:tc>
         <w:tc>
           <w:tcPr>
-            <w:tcW w:w="1101" w:type="dxa"/>
+            <w:tcW w:w="995" w:type="dxa"/>
             <w:tcBorders>
               <w:bottom w:val="single" w:sz="4" w:space="0" w:color="808080"/>
             </w:tcBorders>
@@ -4751,20 +4747,50 @@
             </w:r>
           </w:p>
         </w:tc>
+        <w:tc>
+          <w:tcPr>
+            <w:tcW w:w="995" w:type="dxa"/>
+            <w:tcBorders>
+              <w:bottom w:val="single" w:sz="4" w:space="0" w:color="808080"/>
+            </w:tcBorders>
+            <w:shd w:val="clear" w:color="auto" w:fill="D9D9D9"/>
+            <w:tcMar>
+              <w:top w:w="60" w:type="dxa"/>
+              <w:left w:w="80" w:type="dxa"/>
+              <w:bottom w:w="60" w:type="dxa"/>
+              <w:right w:w="80" w:type="dxa"/>
+            </w:tcMar>
+            <w:vAlign w:val="center"/>
+          </w:tcPr>
+          <w:p>
+            <w:pPr>
+              <w:spacing w:after="0" w:line="240" w:lineRule="auto"/>
+              <w:rPr>
+                <w:b/>
+                <w:bCs/>
+                <w:sz w:val="17"/>
+                <w:szCs w:val="17"/>
+              </w:rPr>
+            </w:pPr>
+            <w:r>
+              <w:rPr>
+                <w:b/>
+                <w:bCs/>
+                <w:sz w:val="17"/>
+                <w:szCs w:val="17"/>
+              </w:rPr>
+              <w:t>Corrida 8</w:t>
+            </w:r>
+          </w:p>
+        </w:tc>
       </w:tr>
       <w:tr>
-        <w:tblPrEx>
-          <w:tblCellMar>
-            <w:top w:w="0" w:type="dxa"/>
-            <w:bottom w:w="0" w:type="dxa"/>
-          </w:tblCellMar>
-        </w:tblPrEx>
         <w:trPr>
           <w:cantSplit/>
         </w:trPr>
         <w:tc>
           <w:tcPr>
-            <w:tcW w:w="2332" w:type="dxa"/>
+            <w:tcW w:w="2080" w:type="dxa"/>
             <w:tcMar>
               <w:top w:w="60" w:type="dxa"/>
               <w:left w:w="80" w:type="dxa"/>
@@ -4790,7 +4816,7 @@
         </w:tc>
         <w:tc>
           <w:tcPr>
-            <w:tcW w:w="1101" w:type="dxa"/>
+            <w:tcW w:w="995" w:type="dxa"/>
             <w:shd w:val="clear" w:color="auto" w:fill="FBE4E4"/>
             <w:tcMar>
               <w:top w:w="60" w:type="dxa"/>
@@ -4818,7 +4844,7 @@
         </w:tc>
         <w:tc>
           <w:tcPr>
-            <w:tcW w:w="1101" w:type="dxa"/>
+            <w:tcW w:w="995" w:type="dxa"/>
             <w:shd w:val="clear" w:color="auto" w:fill="E2F0D9"/>
             <w:tcMar>
               <w:top w:w="60" w:type="dxa"/>
@@ -4846,7 +4872,7 @@
         </w:tc>
         <w:tc>
           <w:tcPr>
-            <w:tcW w:w="1101" w:type="dxa"/>
+            <w:tcW w:w="995" w:type="dxa"/>
             <w:shd w:val="clear" w:color="auto" w:fill="E2F0D9"/>
             <w:tcMar>
               <w:top w:w="60" w:type="dxa"/>
@@ -4874,7 +4900,7 @@
         </w:tc>
         <w:tc>
           <w:tcPr>
-            <w:tcW w:w="1101" w:type="dxa"/>
+            <w:tcW w:w="995" w:type="dxa"/>
             <w:shd w:val="clear" w:color="auto" w:fill="E2F0D9"/>
             <w:tcMar>
               <w:top w:w="60" w:type="dxa"/>
@@ -4902,7 +4928,7 @@
         </w:tc>
         <w:tc>
           <w:tcPr>
-            <w:tcW w:w="1101" w:type="dxa"/>
+            <w:tcW w:w="995" w:type="dxa"/>
             <w:shd w:val="clear" w:color="auto" w:fill="E2F0D9"/>
             <w:tcMar>
               <w:top w:w="60" w:type="dxa"/>
@@ -4930,7 +4956,7 @@
         </w:tc>
         <w:tc>
           <w:tcPr>
-            <w:tcW w:w="1101" w:type="dxa"/>
+            <w:tcW w:w="995" w:type="dxa"/>
             <w:tcBorders>
               <w:bottom w:val="single" w:sz="4" w:space="0" w:color="808080"/>
             </w:tcBorders>
@@ -4968,7 +4994,7 @@
         </w:tc>
         <w:tc>
           <w:tcPr>
-            <w:tcW w:w="1101" w:type="dxa"/>
+            <w:tcW w:w="995" w:type="dxa"/>
             <w:tcBorders>
               <w:bottom w:val="single" w:sz="4" w:space="0" w:color="808080"/>
             </w:tcBorders>
@@ -5004,20 +5030,52 @@
             </w:r>
           </w:p>
         </w:tc>
+        <w:tc>
+          <w:tcPr>
+            <w:tcW w:w="995" w:type="dxa"/>
+            <w:tcBorders>
+              <w:bottom w:val="single" w:sz="4" w:space="0" w:color="808080"/>
+            </w:tcBorders>
+            <w:shd w:val="clear" w:color="auto" w:fill="E2F0D9"/>
+            <w:tcMar>
+              <w:top w:w="60" w:type="dxa"/>
+              <w:left w:w="80" w:type="dxa"/>
+              <w:bottom w:w="60" w:type="dxa"/>
+              <w:right w:w="80" w:type="dxa"/>
+            </w:tcMar>
+            <w:vAlign w:val="center"/>
+          </w:tcPr>
+          <w:p>
+            <w:pPr>
+              <w:spacing w:after="0" w:line="240" w:lineRule="auto"/>
+              <w:rPr>
+                <w:b/>
+                <w:bCs/>
+                <w:color w:val="1E7B34"/>
+                <w:sz w:val="17"/>
+                <w:szCs w:val="17"/>
+              </w:rPr>
+            </w:pPr>
+            <w:r>
+              <w:rPr>
+                <w:b/>
+                <w:bCs/>
+                <w:color w:val="1E7B34"/>
+                <w:sz w:val="17"/>
+                <w:szCs w:val="17"/>
+              </w:rPr>
+              <w:t>Pasó</w:t>
+            </w:r>
+          </w:p>
+        </w:tc>
       </w:tr>
       <w:tr>
-        <w:tblPrEx>
-          <w:tblCellMar>
-            <w:top w:w="0" w:type="dxa"/>
-            <w:bottom w:w="0" w:type="dxa"/>
-          </w:tblCellMar>
-        </w:tblPrEx>
         <w:trPr>
           <w:cantSplit/>
         </w:trPr>
         <w:tc>
           <w:tcPr>
-            <w:tcW w:w="2332" w:type="dxa"/>
+            <w:tcW w:w="2080" w:type="dxa"/>
             <w:tcBorders>
               <w:bottom w:val="single" w:sz="4" w:space="0" w:color="808080"/>
             </w:tcBorders>
@@ -5047,7 +5105,7 @@
         </w:tc>
         <w:tc>
           <w:tcPr>
-            <w:tcW w:w="1101" w:type="dxa"/>
+            <w:tcW w:w="995" w:type="dxa"/>
             <w:tcBorders>
               <w:bottom w:val="single" w:sz="4" w:space="0" w:color="808080"/>
             </w:tcBorders>
@@ -5078,7 +5136,7 @@
         </w:tc>
         <w:tc>
           <w:tcPr>
-            <w:tcW w:w="1101" w:type="dxa"/>
+            <w:tcW w:w="995" w:type="dxa"/>
             <w:tcBorders>
               <w:bottom w:val="single" w:sz="4" w:space="0" w:color="808080"/>
             </w:tcBorders>
@@ -5109,7 +5167,7 @@
         </w:tc>
         <w:tc>
           <w:tcPr>
-            <w:tcW w:w="1101" w:type="dxa"/>
+            <w:tcW w:w="995" w:type="dxa"/>
             <w:tcBorders>
               <w:bottom w:val="single" w:sz="4" w:space="0" w:color="808080"/>
             </w:tcBorders>
@@ -5140,7 +5198,7 @@
         </w:tc>
         <w:tc>
           <w:tcPr>
-            <w:tcW w:w="1101" w:type="dxa"/>
+            <w:tcW w:w="995" w:type="dxa"/>
             <w:tcBorders>
               <w:bottom w:val="single" w:sz="4" w:space="0" w:color="808080"/>
             </w:tcBorders>
@@ -5171,7 +5229,7 @@
         </w:tc>
         <w:tc>
           <w:tcPr>
-            <w:tcW w:w="1101" w:type="dxa"/>
+            <w:tcW w:w="995" w:type="dxa"/>
             <w:tcBorders>
               <w:bottom w:val="single" w:sz="4" w:space="0" w:color="808080"/>
             </w:tcBorders>
@@ -5202,7 +5260,7 @@
         </w:tc>
         <w:tc>
           <w:tcPr>
-            <w:tcW w:w="1101" w:type="dxa"/>
+            <w:tcW w:w="995" w:type="dxa"/>
             <w:tcBorders>
               <w:bottom w:val="single" w:sz="4" w:space="0" w:color="808080"/>
             </w:tcBorders>
@@ -5240,7 +5298,7 @@
         </w:tc>
         <w:tc>
           <w:tcPr>
-            <w:tcW w:w="1101" w:type="dxa"/>
+            <w:tcW w:w="995" w:type="dxa"/>
             <w:tcBorders>
               <w:bottom w:val="single" w:sz="4" w:space="0" w:color="808080"/>
             </w:tcBorders>
@@ -5276,20 +5334,52 @@
             </w:r>
           </w:p>
         </w:tc>
+        <w:tc>
+          <w:tcPr>
+            <w:tcW w:w="995" w:type="dxa"/>
+            <w:tcBorders>
+              <w:bottom w:val="single" w:sz="4" w:space="0" w:color="808080"/>
+            </w:tcBorders>
+            <w:shd w:val="clear" w:color="auto" w:fill="E2F0D9"/>
+            <w:tcMar>
+              <w:top w:w="60" w:type="dxa"/>
+              <w:left w:w="80" w:type="dxa"/>
+              <w:bottom w:w="60" w:type="dxa"/>
+              <w:right w:w="80" w:type="dxa"/>
+            </w:tcMar>
+            <w:vAlign w:val="center"/>
+          </w:tcPr>
+          <w:p>
+            <w:pPr>
+              <w:spacing w:after="0" w:line="240" w:lineRule="auto"/>
+              <w:rPr>
+                <w:b/>
+                <w:bCs/>
+                <w:color w:val="1E7B34"/>
+                <w:sz w:val="17"/>
+                <w:szCs w:val="17"/>
+              </w:rPr>
+            </w:pPr>
+            <w:r>
+              <w:rPr>
+                <w:b/>
+                <w:bCs/>
+                <w:color w:val="1E7B34"/>
+                <w:sz w:val="17"/>
+                <w:szCs w:val="17"/>
+              </w:rPr>
+              <w:t>Pasó</w:t>
+            </w:r>
+          </w:p>
+        </w:tc>
       </w:tr>
       <w:tr>
-        <w:tblPrEx>
-          <w:tblCellMar>
-            <w:top w:w="0" w:type="dxa"/>
-            <w:bottom w:w="0" w:type="dxa"/>
-          </w:tblCellMar>
-        </w:tblPrEx>
         <w:trPr>
           <w:cantSplit/>
         </w:trPr>
         <w:tc>
           <w:tcPr>
-            <w:tcW w:w="2332" w:type="dxa"/>
+            <w:tcW w:w="2080" w:type="dxa"/>
             <w:shd w:val="clear" w:color="auto" w:fill="auto"/>
             <w:tcMar>
               <w:top w:w="60" w:type="dxa"/>
@@ -5322,7 +5412,7 @@
         </w:tc>
         <w:tc>
           <w:tcPr>
-            <w:tcW w:w="1101" w:type="dxa"/>
+            <w:tcW w:w="995" w:type="dxa"/>
             <w:shd w:val="clear" w:color="auto" w:fill="E2F0D9"/>
             <w:tcMar>
               <w:top w:w="60" w:type="dxa"/>
@@ -5357,7 +5447,7 @@
         </w:tc>
         <w:tc>
           <w:tcPr>
-            <w:tcW w:w="1101" w:type="dxa"/>
+            <w:tcW w:w="995" w:type="dxa"/>
             <w:shd w:val="clear" w:color="auto" w:fill="E2F0D9"/>
             <w:tcMar>
               <w:top w:w="60" w:type="dxa"/>
@@ -5392,7 +5482,7 @@
         </w:tc>
         <w:tc>
           <w:tcPr>
-            <w:tcW w:w="1101" w:type="dxa"/>
+            <w:tcW w:w="995" w:type="dxa"/>
             <w:shd w:val="clear" w:color="auto" w:fill="E2F0D9"/>
             <w:tcMar>
               <w:top w:w="60" w:type="dxa"/>
@@ -5427,7 +5517,7 @@
         </w:tc>
         <w:tc>
           <w:tcPr>
-            <w:tcW w:w="1101" w:type="dxa"/>
+            <w:tcW w:w="995" w:type="dxa"/>
             <w:shd w:val="clear" w:color="auto" w:fill="E2F0D9"/>
             <w:tcMar>
               <w:top w:w="60" w:type="dxa"/>
@@ -5462,7 +5552,7 @@
         </w:tc>
         <w:tc>
           <w:tcPr>
-            <w:tcW w:w="1101" w:type="dxa"/>
+            <w:tcW w:w="995" w:type="dxa"/>
             <w:shd w:val="clear" w:color="auto" w:fill="E2F0D9"/>
             <w:tcMar>
               <w:top w:w="60" w:type="dxa"/>
@@ -5497,7 +5587,7 @@
         </w:tc>
         <w:tc>
           <w:tcPr>
-            <w:tcW w:w="1101" w:type="dxa"/>
+            <w:tcW w:w="995" w:type="dxa"/>
             <w:shd w:val="clear" w:color="auto" w:fill="FBE4E4"/>
             <w:tcMar>
               <w:top w:w="60" w:type="dxa"/>
@@ -5532,7 +5622,42 @@
         </w:tc>
         <w:tc>
           <w:tcPr>
-            <w:tcW w:w="1101" w:type="dxa"/>
+            <w:tcW w:w="995" w:type="dxa"/>
+            <w:shd w:val="clear" w:color="auto" w:fill="E2F0D9"/>
+            <w:tcMar>
+              <w:top w:w="60" w:type="dxa"/>
+              <w:left w:w="80" w:type="dxa"/>
+              <w:bottom w:w="60" w:type="dxa"/>
+              <w:right w:w="80" w:type="dxa"/>
+            </w:tcMar>
+            <w:vAlign w:val="center"/>
+          </w:tcPr>
+          <w:p>
+            <w:pPr>
+              <w:spacing w:after="0" w:line="240" w:lineRule="auto"/>
+              <w:rPr>
+                <w:b/>
+                <w:bCs/>
+                <w:color w:val="1E7B34"/>
+                <w:sz w:val="17"/>
+                <w:szCs w:val="17"/>
+              </w:rPr>
+            </w:pPr>
+            <w:r>
+              <w:rPr>
+                <w:b/>
+                <w:bCs/>
+                <w:color w:val="1E7B34"/>
+                <w:sz w:val="17"/>
+                <w:szCs w:val="17"/>
+              </w:rPr>
+              <w:t>Pasó</w:t>
+            </w:r>
+          </w:p>
+        </w:tc>
+        <w:tc>
+          <w:tcPr>
+            <w:tcW w:w="995" w:type="dxa"/>
             <w:shd w:val="clear" w:color="auto" w:fill="E2F0D9"/>
             <w:tcMar>
               <w:top w:w="60" w:type="dxa"/>
@@ -5580,10 +5705,13 @@
         <w:t xml:space="preserve">Resultado final: </w:t>
       </w:r>
       <w:r>
-        <w:t>15 de 15 casos aprobados (100 %) en las corridas 3, 4, 5 y 7 (la corrida 6 dio 14/15 por un fallo del entorno en CP-15, ajeno al sistema).</w:t>
+        <w:t xml:space="preserve">15 de 15 casos aprobados (100 %) </w:t>
       </w:r>
       <w:r>
-        <w:t xml:space="preserve"> Cada corrida dura unos 15 segundos y se puede repetir.</w:t>
+        <w:t>en las corridas 3, 4, 5, 7 y 8 (</w:t>
+      </w:r>
+      <w:r>
+        <w:t>la corrida 6 dio 14/15 por un fallo del entorno en CP-15, ajeno al sistema). Cada corrida dura unos 15 segundos y se puede repetir.</w:t>
       </w:r>
     </w:p>
     <w:p>
@@ -5647,6 +5775,20 @@
     </w:p>
     <w:p>
       <w:pPr>
+        <w:jc w:val="both"/>
+      </w:pPr>
+      <w:r>
+        <w:rPr>
+          <w:b/>
+        </w:rPr>
+        <w:t xml:space="preserve">Verificaciones adicionales (corrida 8): </w:t>
+      </w:r>
+      <w:r>
+        <w:t>solo cambió la capa de vista, con un tema claro. Se abrieron todas las pantallas como administrador y como personal de tienda para revisar el contraste y los textos, y el personal sigue viendo solo sus 7 módulos. Los estados se muestran como insignias, y el faltante o sobrante de caja y la variación de los reportes llevan siempre la palabra y el signo, así que no dependen del color.</w:t>
+      </w:r>
+    </w:p>
+    <w:p>
+      <w:pPr>
         <w:pStyle w:val="Ttulo2"/>
       </w:pPr>
       <w:r>
@@ -5679,12 +5821,6 @@
         <w:gridCol w:w="1809"/>
       </w:tblGrid>
       <w:tr>
-        <w:tblPrEx>
-          <w:tblCellMar>
-            <w:top w:w="0" w:type="dxa"/>
-            <w:bottom w:w="0" w:type="dxa"/>
-          </w:tblCellMar>
-        </w:tblPrEx>
         <w:trPr>
           <w:cantSplit/>
           <w:tblHeader/>
@@ -5826,12 +5962,6 @@
         </w:tc>
       </w:tr>
       <w:tr>
-        <w:tblPrEx>
-          <w:tblCellMar>
-            <w:top w:w="0" w:type="dxa"/>
-            <w:bottom w:w="0" w:type="dxa"/>
-          </w:tblCellMar>
-        </w:tblPrEx>
         <w:trPr>
           <w:cantSplit/>
         </w:trPr>
@@ -5959,12 +6089,6 @@
         </w:tc>
       </w:tr>
       <w:tr>
-        <w:tblPrEx>
-          <w:tblCellMar>
-            <w:top w:w="0" w:type="dxa"/>
-            <w:bottom w:w="0" w:type="dxa"/>
-          </w:tblCellMar>
-        </w:tblPrEx>
         <w:trPr>
           <w:cantSplit/>
         </w:trPr>
@@ -6097,12 +6221,6 @@
         </w:tc>
       </w:tr>
       <w:tr>
-        <w:tblPrEx>
-          <w:tblCellMar>
-            <w:top w:w="0" w:type="dxa"/>
-            <w:bottom w:w="0" w:type="dxa"/>
-          </w:tblCellMar>
-        </w:tblPrEx>
         <w:trPr>
           <w:cantSplit/>
         </w:trPr>
@@ -6230,12 +6348,6 @@
         </w:tc>
       </w:tr>
       <w:tr>
-        <w:tblPrEx>
-          <w:tblCellMar>
-            <w:top w:w="0" w:type="dxa"/>
-            <w:bottom w:w="0" w:type="dxa"/>
-          </w:tblCellMar>
-        </w:tblPrEx>
         <w:trPr>
           <w:cantSplit/>
         </w:trPr>
@@ -6368,12 +6480,6 @@
         </w:tc>
       </w:tr>
       <w:tr>
-        <w:tblPrEx>
-          <w:tblCellMar>
-            <w:top w:w="0" w:type="dxa"/>
-            <w:bottom w:w="0" w:type="dxa"/>
-          </w:tblCellMar>
-        </w:tblPrEx>
         <w:trPr>
           <w:cantSplit/>
         </w:trPr>
@@ -6501,12 +6607,6 @@
         </w:tc>
       </w:tr>
       <w:tr>
-        <w:tblPrEx>
-          <w:tblCellMar>
-            <w:top w:w="0" w:type="dxa"/>
-            <w:bottom w:w="0" w:type="dxa"/>
-          </w:tblCellMar>
-        </w:tblPrEx>
         <w:trPr>
           <w:cantSplit/>
         </w:trPr>
@@ -6639,12 +6739,6 @@
         </w:tc>
       </w:tr>
       <w:tr>
-        <w:tblPrEx>
-          <w:tblCellMar>
-            <w:top w:w="0" w:type="dxa"/>
-            <w:bottom w:w="0" w:type="dxa"/>
-          </w:tblCellMar>
-        </w:tblPrEx>
         <w:trPr>
           <w:cantSplit/>
         </w:trPr>
@@ -6787,12 +6881,6 @@
         </w:tc>
       </w:tr>
       <w:tr>
-        <w:tblPrEx>
-          <w:tblCellMar>
-            <w:top w:w="0" w:type="dxa"/>
-            <w:bottom w:w="0" w:type="dxa"/>
-          </w:tblCellMar>
-        </w:tblPrEx>
         <w:trPr>
           <w:cantSplit/>
         </w:trPr>
@@ -6953,10 +7041,7 @@
         <w:jc w:val="both"/>
       </w:pPr>
       <w:r>
-        <w:t>OBS-02 a OBS-05 se encontraron al revisar el código para escribir los manuales de usuario, no con los casos automatizados. CAM-01 no es un defecto, sino un cambio de alcance decidido por el equipo: el sistema solo registra la forma de pago. OBS-06 atiende la recomendación de guardar las contraseñas con hash. Limitaciones</w:t>
-      </w:r>
-      <w:r>
-        <w:t xml:space="preserve"> conocidas que se dejan documentadas:</w:t>
+        <w:t>OBS-02 a OBS-05 se encontraron al revisar el código para escribir los manuales de usuario, no con los casos automatizados. CAM-01 no es un defecto, sino un cambio de alcance decidido por el equipo: el sistema solo registra la forma de pago. OBS-06 atiende la recomendación de guardar las contraseñas con hash. Limitaciones conocidas que se dejan documentadas:</w:t>
       </w:r>
     </w:p>
     <w:p>
@@ -7020,7 +7105,10 @@
         <w:jc w:val="both"/>
       </w:pPr>
       <w:r>
-        <w:t>Los procesos centrales cumplen las reglas de negocio del documento: los 15 casos aprueban en las corridas 3, 4, 5 y 7.</w:t>
+        <w:t xml:space="preserve">Los procesos centrales cumplen las reglas de negocio del documento: los 15 casos aprueban </w:t>
+      </w:r>
+      <w:r>
+        <w:t>en las corridas 3, 4, 5, 7 y 8.</w:t>
       </w:r>
     </w:p>
     <w:p>
@@ -7104,10 +7192,21 @@
         <w:jc w:val="both"/>
       </w:pPr>
       <w:r>
-        <w:t>Se recomienda validar el rol en todo controlador nuevo de uso administrativo y ejecutar</w:t>
+        <w:t>El rediseño visual con tema claro solo cambió la capa de vista; la corrida 8 confirmó que los 15 casos siguen aprobando.</w:t>
       </w:r>
+    </w:p>
+    <w:p>
+      <w:pPr>
+        <w:pStyle w:val="Prrafodelista"/>
+        <w:numPr>
+          <w:ilvl w:val="0"/>
+          <w:numId w:val="1"/>
+        </w:numPr>
+        <w:spacing w:after="60"/>
+        <w:jc w:val="both"/>
+      </w:pPr>
       <w:r>
-        <w:t xml:space="preserve"> las pruebas antes de cada entrega.</w:t>
+        <w:t>Se recomienda validar el rol en todo controlador nuevo de uso administrativo y ejecutar las pruebas antes de cada entrega.</w:t>
       </w:r>
     </w:p>
     <w:sectPr>

</xml_diff>

<commit_message>
No se reciben lotes vencidos (OBS-07, CP-24) y CP-15 lee el PDF sin mapearlo (OBS-08)
</commit_message>
<xml_diff>
--- a/docs/pruebas/Capitulo_Pruebas.docx
+++ b/docs/pruebas/Capitulo_Pruebas.docx
@@ -31,7 +31,7 @@
         <w:rPr>
           <w:color w:val="595959"/>
         </w:rPr>
-        <w:t>y el 30/10/2026 (corridas 9 y 10).</w:t>
+        <w:t>y el 30/10/2026 (corridas 9 a 16).</w:t>
       </w:r>
     </w:p>
     <w:p>
@@ -62,7 +62,7 @@
         <w:t xml:space="preserve">, compras, cierre de caja y reportes. </w:t>
       </w:r>
       <w:r>
-        <w:t>Se ejecutaron 19 casos de prueba (CP-01 a CP-19)</w:t>
+        <w:t>Se ejecutaron 24 casos de prueba (CP-01 a CP-24)</w:t>
       </w:r>
       <w:r>
         <w:t xml:space="preserve"> sobre la lógica de negocio y la base de datos. La interfaz gráfica solo se usó para comprobar qué módulos ve cada rol.</w:t>
@@ -145,7 +145,10 @@
         <w:t xml:space="preserve">un precio con céntimos sueltos para comprobar que el total </w:t>
       </w:r>
       <w:r>
-        <w:t>no se redondea a 10 céntimos, y un detalle de 4 y de 5 caracteres con el motivo «Otro».</w:t>
+        <w:t xml:space="preserve">no se redondea a 10 céntimos, y un detalle de 4 y de 5 caracteres </w:t>
+      </w:r>
+      <w:r>
+        <w:t>con el motivo «Otro», y un lote que vence hoy frente a uno vencido ayer, al vender y al recibir.</w:t>
       </w:r>
     </w:p>
     <w:p>
@@ -373,7 +376,7 @@
                 <w:sz w:val="20"/>
                 <w:szCs w:val="20"/>
               </w:rPr>
-              <w:t>19 casos</w:t>
+              <w:t>24 casos</w:t>
             </w:r>
             <w:r>
               <w:rPr>
@@ -570,7 +573,7 @@
         <w:t xml:space="preserve">Resultado final de cada caso </w:t>
       </w:r>
       <w:r>
-        <w:t>(corrida 10)</w:t>
+        <w:t>(corrida 16)</w:t>
       </w:r>
       <w:r>
         <w:t>.</w:t>
@@ -4064,6 +4067,9 @@
         <w:tc>
           <w:tcPr>
             <w:tcW w:w="702" w:type="dxa"/>
+            <w:tcBorders>
+              <w:bottom w:val="single" w:sz="4" w:space="0" w:color="808080"/>
+            </w:tcBorders>
             <w:shd w:val="clear" w:color="auto" w:fill="auto"/>
             <w:tcMar>
               <w:top w:w="60" w:type="dxa"/>
@@ -4097,6 +4103,9 @@
         <w:tc>
           <w:tcPr>
             <w:tcW w:w="1305" w:type="dxa"/>
+            <w:tcBorders>
+              <w:bottom w:val="single" w:sz="4" w:space="0" w:color="808080"/>
+            </w:tcBorders>
             <w:shd w:val="clear" w:color="auto" w:fill="auto"/>
             <w:tcMar>
               <w:top w:w="60" w:type="dxa"/>
@@ -4126,6 +4135,9 @@
         <w:tc>
           <w:tcPr>
             <w:tcW w:w="2008" w:type="dxa"/>
+            <w:tcBorders>
+              <w:bottom w:val="single" w:sz="4" w:space="0" w:color="808080"/>
+            </w:tcBorders>
             <w:shd w:val="clear" w:color="auto" w:fill="auto"/>
             <w:tcMar>
               <w:top w:w="60" w:type="dxa"/>
@@ -4155,6 +4167,9 @@
         <w:tc>
           <w:tcPr>
             <w:tcW w:w="2309" w:type="dxa"/>
+            <w:tcBorders>
+              <w:bottom w:val="single" w:sz="4" w:space="0" w:color="808080"/>
+            </w:tcBorders>
             <w:shd w:val="clear" w:color="auto" w:fill="auto"/>
             <w:tcMar>
               <w:top w:w="60" w:type="dxa"/>
@@ -4184,6 +4199,9 @@
         <w:tc>
           <w:tcPr>
             <w:tcW w:w="2811" w:type="dxa"/>
+            <w:tcBorders>
+              <w:bottom w:val="single" w:sz="4" w:space="0" w:color="808080"/>
+            </w:tcBorders>
             <w:shd w:val="clear" w:color="auto" w:fill="auto"/>
             <w:tcMar>
               <w:top w:w="60" w:type="dxa"/>
@@ -4207,6 +4225,1026 @@
                 <w:szCs w:val="17"/>
               </w:rPr>
               <w:t>Venta ANULADA con el motivo en el comprobante, stock 10. Registro con admin, rol ADMINISTRADOR, «Error en el cobro», sin detalle y S/ 23.60; aparece en el registro del administrador</w:t>
+            </w:r>
+          </w:p>
+        </w:tc>
+        <w:tc>
+          <w:tcPr>
+            <w:tcW w:w="905" w:type="dxa"/>
+            <w:tcBorders>
+              <w:bottom w:val="single" w:sz="4" w:space="0" w:color="808080"/>
+            </w:tcBorders>
+            <w:shd w:val="clear" w:color="auto" w:fill="E2F0D9"/>
+            <w:tcMar>
+              <w:top w:w="60" w:type="dxa"/>
+              <w:left w:w="80" w:type="dxa"/>
+              <w:bottom w:w="60" w:type="dxa"/>
+              <w:right w:w="80" w:type="dxa"/>
+            </w:tcMar>
+            <w:vAlign w:val="center"/>
+          </w:tcPr>
+          <w:p>
+            <w:pPr>
+              <w:spacing w:after="0" w:line="240" w:lineRule="auto"/>
+              <w:rPr>
+                <w:b/>
+                <w:bCs/>
+                <w:color w:val="1E7B34"/>
+                <w:sz w:val="17"/>
+                <w:szCs w:val="17"/>
+              </w:rPr>
+            </w:pPr>
+            <w:r>
+              <w:rPr>
+                <w:b/>
+                <w:bCs/>
+                <w:color w:val="1E7B34"/>
+                <w:sz w:val="17"/>
+                <w:szCs w:val="17"/>
+              </w:rPr>
+              <w:t>Pasó</w:t>
+            </w:r>
+          </w:p>
+        </w:tc>
+      </w:tr>
+      <w:tr>
+        <w:trPr>
+          <w:cantSplit/>
+        </w:trPr>
+        <w:tc>
+          <w:tcPr>
+            <w:tcW w:w="702" w:type="dxa"/>
+            <w:tcBorders>
+              <w:bottom w:val="single" w:sz="4" w:space="0" w:color="808080"/>
+            </w:tcBorders>
+            <w:shd w:val="clear" w:color="auto" w:fill="F2F2F2"/>
+            <w:tcMar>
+              <w:top w:w="60" w:type="dxa"/>
+              <w:left w:w="80" w:type="dxa"/>
+              <w:bottom w:w="60" w:type="dxa"/>
+              <w:right w:w="80" w:type="dxa"/>
+            </w:tcMar>
+            <w:vAlign w:val="center"/>
+          </w:tcPr>
+          <w:p>
+            <w:pPr>
+              <w:spacing w:after="0" w:line="240" w:lineRule="auto"/>
+              <w:rPr>
+                <w:b/>
+                <w:bCs/>
+                <w:sz w:val="17"/>
+                <w:szCs w:val="17"/>
+              </w:rPr>
+            </w:pPr>
+            <w:r>
+              <w:rPr>
+                <w:b/>
+                <w:bCs/>
+                <w:sz w:val="17"/>
+                <w:szCs w:val="17"/>
+              </w:rPr>
+              <w:t>CP-20</w:t>
+            </w:r>
+          </w:p>
+        </w:tc>
+        <w:tc>
+          <w:tcPr>
+            <w:tcW w:w="1305" w:type="dxa"/>
+            <w:tcBorders>
+              <w:bottom w:val="single" w:sz="4" w:space="0" w:color="808080"/>
+            </w:tcBorders>
+            <w:shd w:val="clear" w:color="auto" w:fill="F2F2F2"/>
+            <w:tcMar>
+              <w:top w:w="60" w:type="dxa"/>
+              <w:left w:w="80" w:type="dxa"/>
+              <w:bottom w:w="60" w:type="dxa"/>
+              <w:right w:w="80" w:type="dxa"/>
+            </w:tcMar>
+            <w:vAlign w:val="center"/>
+          </w:tcPr>
+          <w:p>
+            <w:pPr>
+              <w:spacing w:after="0" w:line="240" w:lineRule="auto"/>
+              <w:rPr>
+                <w:sz w:val="17"/>
+                <w:szCs w:val="17"/>
+              </w:rPr>
+            </w:pPr>
+            <w:r>
+              <w:rPr>
+                <w:sz w:val="17"/>
+                <w:szCs w:val="17"/>
+              </w:rPr>
+              <w:t>FEFO con el mismo vencimiento (proceso 08)</w:t>
+            </w:r>
+          </w:p>
+        </w:tc>
+        <w:tc>
+          <w:tcPr>
+            <w:tcW w:w="2008" w:type="dxa"/>
+            <w:tcBorders>
+              <w:bottom w:val="single" w:sz="4" w:space="0" w:color="808080"/>
+            </w:tcBorders>
+            <w:shd w:val="clear" w:color="auto" w:fill="F2F2F2"/>
+            <w:tcMar>
+              <w:top w:w="60" w:type="dxa"/>
+              <w:left w:w="80" w:type="dxa"/>
+              <w:bottom w:w="60" w:type="dxa"/>
+              <w:right w:w="80" w:type="dxa"/>
+            </w:tcMar>
+            <w:vAlign w:val="center"/>
+          </w:tcPr>
+          <w:p>
+            <w:pPr>
+              <w:spacing w:after="0" w:line="240" w:lineRule="auto"/>
+              <w:rPr>
+                <w:sz w:val="17"/>
+                <w:szCs w:val="17"/>
+              </w:rPr>
+            </w:pPr>
+            <w:r>
+              <w:rPr>
+                <w:sz w:val="17"/>
+                <w:szCs w:val="17"/>
+              </w:rPr>
+              <w:t>Dos lotes con la misma fecha de vencimiento: entra primero CP20-Z y después CP20-A (4 u. cada uno); dos ventas de 3 u.</w:t>
+            </w:r>
+          </w:p>
+        </w:tc>
+        <w:tc>
+          <w:tcPr>
+            <w:tcW w:w="2309" w:type="dxa"/>
+            <w:tcBorders>
+              <w:bottom w:val="single" w:sz="4" w:space="0" w:color="808080"/>
+            </w:tcBorders>
+            <w:shd w:val="clear" w:color="auto" w:fill="F2F2F2"/>
+            <w:tcMar>
+              <w:top w:w="60" w:type="dxa"/>
+              <w:left w:w="80" w:type="dxa"/>
+              <w:bottom w:w="60" w:type="dxa"/>
+              <w:right w:w="80" w:type="dxa"/>
+            </w:tcMar>
+            <w:vAlign w:val="center"/>
+          </w:tcPr>
+          <w:p>
+            <w:pPr>
+              <w:spacing w:after="0" w:line="240" w:lineRule="auto"/>
+              <w:rPr>
+                <w:sz w:val="17"/>
+                <w:szCs w:val="17"/>
+              </w:rPr>
+            </w:pPr>
+            <w:r>
+              <w:rPr>
+                <w:sz w:val="17"/>
+                <w:szCs w:val="17"/>
+              </w:rPr>
+              <w:t>Sale primero el lote que entró antes, sin importar su número; al agotarse, sigue con el siguiente</w:t>
+            </w:r>
+          </w:p>
+        </w:tc>
+        <w:tc>
+          <w:tcPr>
+            <w:tcW w:w="2811" w:type="dxa"/>
+            <w:tcBorders>
+              <w:bottom w:val="single" w:sz="4" w:space="0" w:color="808080"/>
+            </w:tcBorders>
+            <w:shd w:val="clear" w:color="auto" w:fill="F2F2F2"/>
+            <w:tcMar>
+              <w:top w:w="60" w:type="dxa"/>
+              <w:left w:w="80" w:type="dxa"/>
+              <w:bottom w:w="60" w:type="dxa"/>
+              <w:right w:w="80" w:type="dxa"/>
+            </w:tcMar>
+            <w:vAlign w:val="center"/>
+          </w:tcPr>
+          <w:p>
+            <w:pPr>
+              <w:spacing w:after="0" w:line="240" w:lineRule="auto"/>
+              <w:rPr>
+                <w:sz w:val="17"/>
+                <w:szCs w:val="17"/>
+              </w:rPr>
+            </w:pPr>
+            <w:r>
+              <w:rPr>
+                <w:sz w:val="17"/>
+                <w:szCs w:val="17"/>
+              </w:rPr>
+              <w:t>Primera venta: 3 u. de CP20-Z. Segunda: 1 u. de CP20-Z y 2 de CP20-A. Quedan 0 y 2; stock 2</w:t>
+            </w:r>
+          </w:p>
+        </w:tc>
+        <w:tc>
+          <w:tcPr>
+            <w:tcW w:w="905" w:type="dxa"/>
+            <w:tcBorders>
+              <w:bottom w:val="single" w:sz="4" w:space="0" w:color="808080"/>
+            </w:tcBorders>
+            <w:shd w:val="clear" w:color="auto" w:fill="E2F0D9"/>
+            <w:tcMar>
+              <w:top w:w="60" w:type="dxa"/>
+              <w:left w:w="80" w:type="dxa"/>
+              <w:bottom w:w="60" w:type="dxa"/>
+              <w:right w:w="80" w:type="dxa"/>
+            </w:tcMar>
+            <w:vAlign w:val="center"/>
+          </w:tcPr>
+          <w:p>
+            <w:pPr>
+              <w:spacing w:after="0" w:line="240" w:lineRule="auto"/>
+              <w:rPr>
+                <w:b/>
+                <w:bCs/>
+                <w:color w:val="1E7B34"/>
+                <w:sz w:val="17"/>
+                <w:szCs w:val="17"/>
+              </w:rPr>
+            </w:pPr>
+            <w:r>
+              <w:rPr>
+                <w:b/>
+                <w:bCs/>
+                <w:color w:val="1E7B34"/>
+                <w:sz w:val="17"/>
+                <w:szCs w:val="17"/>
+              </w:rPr>
+              <w:t>Pasó</w:t>
+            </w:r>
+          </w:p>
+        </w:tc>
+      </w:tr>
+      <w:tr>
+        <w:trPr>
+          <w:cantSplit/>
+        </w:trPr>
+        <w:tc>
+          <w:tcPr>
+            <w:tcW w:w="702" w:type="dxa"/>
+            <w:tcBorders>
+              <w:bottom w:val="single" w:sz="4" w:space="0" w:color="808080"/>
+            </w:tcBorders>
+            <w:shd w:val="clear" w:color="auto" w:fill="auto"/>
+            <w:tcMar>
+              <w:top w:w="60" w:type="dxa"/>
+              <w:left w:w="80" w:type="dxa"/>
+              <w:bottom w:w="60" w:type="dxa"/>
+              <w:right w:w="80" w:type="dxa"/>
+            </w:tcMar>
+            <w:vAlign w:val="center"/>
+          </w:tcPr>
+          <w:p>
+            <w:pPr>
+              <w:spacing w:after="0" w:line="240" w:lineRule="auto"/>
+              <w:rPr>
+                <w:b/>
+                <w:bCs/>
+                <w:sz w:val="17"/>
+                <w:szCs w:val="17"/>
+              </w:rPr>
+            </w:pPr>
+            <w:r>
+              <w:rPr>
+                <w:b/>
+                <w:bCs/>
+                <w:sz w:val="17"/>
+                <w:szCs w:val="17"/>
+              </w:rPr>
+              <w:t>CP-21</w:t>
+            </w:r>
+          </w:p>
+        </w:tc>
+        <w:tc>
+          <w:tcPr>
+            <w:tcW w:w="1305" w:type="dxa"/>
+            <w:tcBorders>
+              <w:bottom w:val="single" w:sz="4" w:space="0" w:color="808080"/>
+            </w:tcBorders>
+            <w:shd w:val="clear" w:color="auto" w:fill="auto"/>
+            <w:tcMar>
+              <w:top w:w="60" w:type="dxa"/>
+              <w:left w:w="80" w:type="dxa"/>
+              <w:bottom w:w="60" w:type="dxa"/>
+              <w:right w:w="80" w:type="dxa"/>
+            </w:tcMar>
+            <w:vAlign w:val="center"/>
+          </w:tcPr>
+          <w:p>
+            <w:pPr>
+              <w:spacing w:after="0" w:line="240" w:lineRule="auto"/>
+              <w:rPr>
+                <w:sz w:val="17"/>
+                <w:szCs w:val="17"/>
+              </w:rPr>
+            </w:pPr>
+            <w:r>
+              <w:rPr>
+                <w:sz w:val="17"/>
+                <w:szCs w:val="17"/>
+              </w:rPr>
+              <w:t>Lotes vencidos (proceso 08)</w:t>
+            </w:r>
+          </w:p>
+        </w:tc>
+        <w:tc>
+          <w:tcPr>
+            <w:tcW w:w="2008" w:type="dxa"/>
+            <w:tcBorders>
+              <w:bottom w:val="single" w:sz="4" w:space="0" w:color="808080"/>
+            </w:tcBorders>
+            <w:shd w:val="clear" w:color="auto" w:fill="auto"/>
+            <w:tcMar>
+              <w:top w:w="60" w:type="dxa"/>
+              <w:left w:w="80" w:type="dxa"/>
+              <w:bottom w:w="60" w:type="dxa"/>
+              <w:right w:w="80" w:type="dxa"/>
+            </w:tcMar>
+            <w:vAlign w:val="center"/>
+          </w:tcPr>
+          <w:p>
+            <w:pPr>
+              <w:spacing w:after="0" w:line="240" w:lineRule="auto"/>
+              <w:rPr>
+                <w:sz w:val="17"/>
+                <w:szCs w:val="17"/>
+              </w:rPr>
+            </w:pPr>
+            <w:r>
+              <w:rPr>
+                <w:sz w:val="17"/>
+                <w:szCs w:val="17"/>
+              </w:rPr>
+              <w:t>Lote vencido ayer (5 u.), lote que vence hoy (2 u.) y lote vigente (3 u.); venta de 4 u. y luego de 2 u.</w:t>
+            </w:r>
+          </w:p>
+        </w:tc>
+        <w:tc>
+          <w:tcPr>
+            <w:tcW w:w="2309" w:type="dxa"/>
+            <w:tcBorders>
+              <w:bottom w:val="single" w:sz="4" w:space="0" w:color="808080"/>
+            </w:tcBorders>
+            <w:shd w:val="clear" w:color="auto" w:fill="auto"/>
+            <w:tcMar>
+              <w:top w:w="60" w:type="dxa"/>
+              <w:left w:w="80" w:type="dxa"/>
+              <w:bottom w:w="60" w:type="dxa"/>
+              <w:right w:w="80" w:type="dxa"/>
+            </w:tcMar>
+            <w:vAlign w:val="center"/>
+          </w:tcPr>
+          <w:p>
+            <w:pPr>
+              <w:spacing w:after="0" w:line="240" w:lineRule="auto"/>
+              <w:rPr>
+                <w:sz w:val="17"/>
+                <w:szCs w:val="17"/>
+              </w:rPr>
+            </w:pPr>
+            <w:r>
+              <w:rPr>
+                <w:sz w:val="17"/>
+                <w:szCs w:val="17"/>
+              </w:rPr>
+              <w:t>El lote vencido no se vende ni se ofrece; el que vence hoy sí (valor límite); la venta que necesitaría el vencido se rechaza sin cambios</w:t>
+            </w:r>
+          </w:p>
+        </w:tc>
+        <w:tc>
+          <w:tcPr>
+            <w:tcW w:w="2811" w:type="dxa"/>
+            <w:tcBorders>
+              <w:bottom w:val="single" w:sz="4" w:space="0" w:color="808080"/>
+            </w:tcBorders>
+            <w:shd w:val="clear" w:color="auto" w:fill="auto"/>
+            <w:tcMar>
+              <w:top w:w="60" w:type="dxa"/>
+              <w:left w:w="80" w:type="dxa"/>
+              <w:bottom w:w="60" w:type="dxa"/>
+              <w:right w:w="80" w:type="dxa"/>
+            </w:tcMar>
+            <w:vAlign w:val="center"/>
+          </w:tcPr>
+          <w:p>
+            <w:pPr>
+              <w:spacing w:after="0" w:line="240" w:lineRule="auto"/>
+              <w:rPr>
+                <w:sz w:val="17"/>
+                <w:szCs w:val="17"/>
+              </w:rPr>
+            </w:pPr>
+            <w:r>
+              <w:rPr>
+                <w:sz w:val="17"/>
+                <w:szCs w:val="17"/>
+              </w:rPr>
+              <w:t>Ventas ofrece 5 u. (sin el vencido). La venta de 4 u. toma 2 del que vence hoy y 2 del vigente; la de 2 u. se rechaza sin registros. El lote vencido sigue con 5</w:t>
+            </w:r>
+          </w:p>
+        </w:tc>
+        <w:tc>
+          <w:tcPr>
+            <w:tcW w:w="905" w:type="dxa"/>
+            <w:tcBorders>
+              <w:bottom w:val="single" w:sz="4" w:space="0" w:color="808080"/>
+            </w:tcBorders>
+            <w:shd w:val="clear" w:color="auto" w:fill="E2F0D9"/>
+            <w:tcMar>
+              <w:top w:w="60" w:type="dxa"/>
+              <w:left w:w="80" w:type="dxa"/>
+              <w:bottom w:w="60" w:type="dxa"/>
+              <w:right w:w="80" w:type="dxa"/>
+            </w:tcMar>
+            <w:vAlign w:val="center"/>
+          </w:tcPr>
+          <w:p>
+            <w:pPr>
+              <w:spacing w:after="0" w:line="240" w:lineRule="auto"/>
+              <w:rPr>
+                <w:b/>
+                <w:bCs/>
+                <w:color w:val="1E7B34"/>
+                <w:sz w:val="17"/>
+                <w:szCs w:val="17"/>
+              </w:rPr>
+            </w:pPr>
+            <w:r>
+              <w:rPr>
+                <w:b/>
+                <w:bCs/>
+                <w:color w:val="1E7B34"/>
+                <w:sz w:val="17"/>
+                <w:szCs w:val="17"/>
+              </w:rPr>
+              <w:t>Pasó</w:t>
+            </w:r>
+          </w:p>
+        </w:tc>
+      </w:tr>
+      <w:tr>
+        <w:trPr>
+          <w:cantSplit/>
+        </w:trPr>
+        <w:tc>
+          <w:tcPr>
+            <w:tcW w:w="702" w:type="dxa"/>
+            <w:tcBorders>
+              <w:bottom w:val="single" w:sz="4" w:space="0" w:color="808080"/>
+            </w:tcBorders>
+            <w:shd w:val="clear" w:color="auto" w:fill="F2F2F2"/>
+            <w:tcMar>
+              <w:top w:w="60" w:type="dxa"/>
+              <w:left w:w="80" w:type="dxa"/>
+              <w:bottom w:w="60" w:type="dxa"/>
+              <w:right w:w="80" w:type="dxa"/>
+            </w:tcMar>
+            <w:vAlign w:val="center"/>
+          </w:tcPr>
+          <w:p>
+            <w:pPr>
+              <w:spacing w:after="0" w:line="240" w:lineRule="auto"/>
+              <w:rPr>
+                <w:b/>
+                <w:bCs/>
+                <w:sz w:val="17"/>
+                <w:szCs w:val="17"/>
+              </w:rPr>
+            </w:pPr>
+            <w:r>
+              <w:rPr>
+                <w:b/>
+                <w:bCs/>
+                <w:sz w:val="17"/>
+                <w:szCs w:val="17"/>
+              </w:rPr>
+              <w:t>CP-22</w:t>
+            </w:r>
+          </w:p>
+        </w:tc>
+        <w:tc>
+          <w:tcPr>
+            <w:tcW w:w="1305" w:type="dxa"/>
+            <w:tcBorders>
+              <w:bottom w:val="single" w:sz="4" w:space="0" w:color="808080"/>
+            </w:tcBorders>
+            <w:shd w:val="clear" w:color="auto" w:fill="F2F2F2"/>
+            <w:tcMar>
+              <w:top w:w="60" w:type="dxa"/>
+              <w:left w:w="80" w:type="dxa"/>
+              <w:bottom w:w="60" w:type="dxa"/>
+              <w:right w:w="80" w:type="dxa"/>
+            </w:tcMar>
+            <w:vAlign w:val="center"/>
+          </w:tcPr>
+          <w:p>
+            <w:pPr>
+              <w:spacing w:after="0" w:line="240" w:lineRule="auto"/>
+              <w:rPr>
+                <w:sz w:val="17"/>
+                <w:szCs w:val="17"/>
+              </w:rPr>
+            </w:pPr>
+            <w:r>
+              <w:rPr>
+                <w:sz w:val="17"/>
+                <w:szCs w:val="17"/>
+              </w:rPr>
+              <w:t>Productos sin vencimiento (proceso 08)</w:t>
+            </w:r>
+          </w:p>
+        </w:tc>
+        <w:tc>
+          <w:tcPr>
+            <w:tcW w:w="2008" w:type="dxa"/>
+            <w:tcBorders>
+              <w:bottom w:val="single" w:sz="4" w:space="0" w:color="808080"/>
+            </w:tcBorders>
+            <w:shd w:val="clear" w:color="auto" w:fill="F2F2F2"/>
+            <w:tcMar>
+              <w:top w:w="60" w:type="dxa"/>
+              <w:left w:w="80" w:type="dxa"/>
+              <w:bottom w:w="60" w:type="dxa"/>
+              <w:right w:w="80" w:type="dxa"/>
+            </w:tcMar>
+            <w:vAlign w:val="center"/>
+          </w:tcPr>
+          <w:p>
+            <w:pPr>
+              <w:spacing w:after="0" w:line="240" w:lineRule="auto"/>
+              <w:rPr>
+                <w:sz w:val="17"/>
+                <w:szCs w:val="17"/>
+              </w:rPr>
+            </w:pPr>
+            <w:r>
+              <w:rPr>
+                <w:sz w:val="17"/>
+                <w:szCs w:val="17"/>
+              </w:rPr>
+              <w:t>Tres lotes sin vencimiento recibidos en el orden CP22-SEGUNDO, CP22-PRIMERO, CP22-TERCERO (3 u. cada uno); venta de 5 u.</w:t>
+            </w:r>
+          </w:p>
+        </w:tc>
+        <w:tc>
+          <w:tcPr>
+            <w:tcW w:w="2309" w:type="dxa"/>
+            <w:tcBorders>
+              <w:bottom w:val="single" w:sz="4" w:space="0" w:color="808080"/>
+            </w:tcBorders>
+            <w:shd w:val="clear" w:color="auto" w:fill="F2F2F2"/>
+            <w:tcMar>
+              <w:top w:w="60" w:type="dxa"/>
+              <w:left w:w="80" w:type="dxa"/>
+              <w:bottom w:w="60" w:type="dxa"/>
+              <w:right w:w="80" w:type="dxa"/>
+            </w:tcMar>
+            <w:vAlign w:val="center"/>
+          </w:tcPr>
+          <w:p>
+            <w:pPr>
+              <w:spacing w:after="0" w:line="240" w:lineRule="auto"/>
+              <w:rPr>
+                <w:sz w:val="17"/>
+                <w:szCs w:val="17"/>
+              </w:rPr>
+            </w:pPr>
+            <w:r>
+              <w:rPr>
+                <w:sz w:val="17"/>
+                <w:szCs w:val="17"/>
+              </w:rPr>
+              <w:t>Los lotes salen por orden de ingreso, no por su nombre</w:t>
+            </w:r>
+          </w:p>
+        </w:tc>
+        <w:tc>
+          <w:tcPr>
+            <w:tcW w:w="2811" w:type="dxa"/>
+            <w:tcBorders>
+              <w:bottom w:val="single" w:sz="4" w:space="0" w:color="808080"/>
+            </w:tcBorders>
+            <w:shd w:val="clear" w:color="auto" w:fill="F2F2F2"/>
+            <w:tcMar>
+              <w:top w:w="60" w:type="dxa"/>
+              <w:left w:w="80" w:type="dxa"/>
+              <w:bottom w:w="60" w:type="dxa"/>
+              <w:right w:w="80" w:type="dxa"/>
+            </w:tcMar>
+            <w:vAlign w:val="center"/>
+          </w:tcPr>
+          <w:p>
+            <w:pPr>
+              <w:spacing w:after="0" w:line="240" w:lineRule="auto"/>
+              <w:rPr>
+                <w:sz w:val="17"/>
+                <w:szCs w:val="17"/>
+              </w:rPr>
+            </w:pPr>
+            <w:r>
+              <w:rPr>
+                <w:sz w:val="17"/>
+                <w:szCs w:val="17"/>
+              </w:rPr>
+              <w:t>3 u. de CP22-SEGUNDO y 2 de CP22-PRIMERO; CP22-TERCERO queda intacto; stock 4</w:t>
+            </w:r>
+          </w:p>
+        </w:tc>
+        <w:tc>
+          <w:tcPr>
+            <w:tcW w:w="905" w:type="dxa"/>
+            <w:tcBorders>
+              <w:bottom w:val="single" w:sz="4" w:space="0" w:color="808080"/>
+            </w:tcBorders>
+            <w:shd w:val="clear" w:color="auto" w:fill="E2F0D9"/>
+            <w:tcMar>
+              <w:top w:w="60" w:type="dxa"/>
+              <w:left w:w="80" w:type="dxa"/>
+              <w:bottom w:w="60" w:type="dxa"/>
+              <w:right w:w="80" w:type="dxa"/>
+            </w:tcMar>
+            <w:vAlign w:val="center"/>
+          </w:tcPr>
+          <w:p>
+            <w:pPr>
+              <w:spacing w:after="0" w:line="240" w:lineRule="auto"/>
+              <w:rPr>
+                <w:b/>
+                <w:bCs/>
+                <w:color w:val="1E7B34"/>
+                <w:sz w:val="17"/>
+                <w:szCs w:val="17"/>
+              </w:rPr>
+            </w:pPr>
+            <w:r>
+              <w:rPr>
+                <w:b/>
+                <w:bCs/>
+                <w:color w:val="1E7B34"/>
+                <w:sz w:val="17"/>
+                <w:szCs w:val="17"/>
+              </w:rPr>
+              <w:t>Pasó</w:t>
+            </w:r>
+          </w:p>
+        </w:tc>
+      </w:tr>
+      <w:tr>
+        <w:trPr>
+          <w:cantSplit/>
+        </w:trPr>
+        <w:tc>
+          <w:tcPr>
+            <w:tcW w:w="702" w:type="dxa"/>
+            <w:tcBorders>
+              <w:bottom w:val="single" w:sz="4" w:space="0" w:color="808080"/>
+            </w:tcBorders>
+            <w:shd w:val="clear" w:color="auto" w:fill="auto"/>
+            <w:tcMar>
+              <w:top w:w="60" w:type="dxa"/>
+              <w:left w:w="80" w:type="dxa"/>
+              <w:bottom w:w="60" w:type="dxa"/>
+              <w:right w:w="80" w:type="dxa"/>
+            </w:tcMar>
+            <w:vAlign w:val="center"/>
+          </w:tcPr>
+          <w:p>
+            <w:pPr>
+              <w:spacing w:after="0" w:line="240" w:lineRule="auto"/>
+              <w:rPr>
+                <w:b/>
+                <w:bCs/>
+                <w:sz w:val="17"/>
+                <w:szCs w:val="17"/>
+              </w:rPr>
+            </w:pPr>
+            <w:r>
+              <w:rPr>
+                <w:b/>
+                <w:bCs/>
+                <w:sz w:val="17"/>
+                <w:szCs w:val="17"/>
+              </w:rPr>
+              <w:t>CP-23</w:t>
+            </w:r>
+          </w:p>
+        </w:tc>
+        <w:tc>
+          <w:tcPr>
+            <w:tcW w:w="1305" w:type="dxa"/>
+            <w:tcBorders>
+              <w:bottom w:val="single" w:sz="4" w:space="0" w:color="808080"/>
+            </w:tcBorders>
+            <w:shd w:val="clear" w:color="auto" w:fill="auto"/>
+            <w:tcMar>
+              <w:top w:w="60" w:type="dxa"/>
+              <w:left w:w="80" w:type="dxa"/>
+              <w:bottom w:w="60" w:type="dxa"/>
+              <w:right w:w="80" w:type="dxa"/>
+            </w:tcMar>
+            <w:vAlign w:val="center"/>
+          </w:tcPr>
+          <w:p>
+            <w:pPr>
+              <w:spacing w:after="0" w:line="240" w:lineRule="auto"/>
+              <w:rPr>
+                <w:sz w:val="17"/>
+                <w:szCs w:val="17"/>
+              </w:rPr>
+            </w:pPr>
+            <w:r>
+              <w:rPr>
+                <w:sz w:val="17"/>
+                <w:szCs w:val="17"/>
+              </w:rPr>
+              <w:t>Venta con varios lotes (proceso 08)</w:t>
+            </w:r>
+          </w:p>
+        </w:tc>
+        <w:tc>
+          <w:tcPr>
+            <w:tcW w:w="2008" w:type="dxa"/>
+            <w:tcBorders>
+              <w:bottom w:val="single" w:sz="4" w:space="0" w:color="808080"/>
+            </w:tcBorders>
+            <w:shd w:val="clear" w:color="auto" w:fill="auto"/>
+            <w:tcMar>
+              <w:top w:w="60" w:type="dxa"/>
+              <w:left w:w="80" w:type="dxa"/>
+              <w:bottom w:w="60" w:type="dxa"/>
+              <w:right w:w="80" w:type="dxa"/>
+            </w:tcMar>
+            <w:vAlign w:val="center"/>
+          </w:tcPr>
+          <w:p>
+            <w:pPr>
+              <w:spacing w:after="0" w:line="240" w:lineRule="auto"/>
+              <w:rPr>
+                <w:sz w:val="17"/>
+                <w:szCs w:val="17"/>
+              </w:rPr>
+            </w:pPr>
+            <w:r>
+              <w:rPr>
+                <w:sz w:val="17"/>
+                <w:szCs w:val="17"/>
+              </w:rPr>
+              <w:t>Cuatro lotes recibidos en desorden: C (vence en 90 días, 5 u.), A (10 días, 2 u.), sin vencimiento (4 u.) y B (40 días, 2 u.); venta de 10 u.</w:t>
+            </w:r>
+          </w:p>
+        </w:tc>
+        <w:tc>
+          <w:tcPr>
+            <w:tcW w:w="2309" w:type="dxa"/>
+            <w:tcBorders>
+              <w:bottom w:val="single" w:sz="4" w:space="0" w:color="808080"/>
+            </w:tcBorders>
+            <w:shd w:val="clear" w:color="auto" w:fill="auto"/>
+            <w:tcMar>
+              <w:top w:w="60" w:type="dxa"/>
+              <w:left w:w="80" w:type="dxa"/>
+              <w:bottom w:w="60" w:type="dxa"/>
+              <w:right w:w="80" w:type="dxa"/>
+            </w:tcMar>
+            <w:vAlign w:val="center"/>
+          </w:tcPr>
+          <w:p>
+            <w:pPr>
+              <w:spacing w:after="0" w:line="240" w:lineRule="auto"/>
+              <w:rPr>
+                <w:sz w:val="17"/>
+                <w:szCs w:val="17"/>
+              </w:rPr>
+            </w:pPr>
+            <w:r>
+              <w:rPr>
+                <w:sz w:val="17"/>
+                <w:szCs w:val="17"/>
+              </w:rPr>
+              <w:t>Recorre los lotes por vencimiento y deja al final el que no vence; registra de qué lote salió cada unidad en venta_lotes y en movimientos</w:t>
+            </w:r>
+          </w:p>
+        </w:tc>
+        <w:tc>
+          <w:tcPr>
+            <w:tcW w:w="2811" w:type="dxa"/>
+            <w:tcBorders>
+              <w:bottom w:val="single" w:sz="4" w:space="0" w:color="808080"/>
+            </w:tcBorders>
+            <w:shd w:val="clear" w:color="auto" w:fill="auto"/>
+            <w:tcMar>
+              <w:top w:w="60" w:type="dxa"/>
+              <w:left w:w="80" w:type="dxa"/>
+              <w:bottom w:w="60" w:type="dxa"/>
+              <w:right w:w="80" w:type="dxa"/>
+            </w:tcMar>
+            <w:vAlign w:val="center"/>
+          </w:tcPr>
+          <w:p>
+            <w:pPr>
+              <w:spacing w:after="0" w:line="240" w:lineRule="auto"/>
+              <w:rPr>
+                <w:sz w:val="17"/>
+                <w:szCs w:val="17"/>
+              </w:rPr>
+            </w:pPr>
+            <w:r>
+              <w:rPr>
+                <w:sz w:val="17"/>
+                <w:szCs w:val="17"/>
+              </w:rPr>
+              <w:t>venta_lotes: A 2, B 2, C 5 y sin vencimiento 1, en ese orden. Movimientos: una salida por lote con stock resultante 11, 9, 4 y 3. Stock 3</w:t>
+            </w:r>
+          </w:p>
+        </w:tc>
+        <w:tc>
+          <w:tcPr>
+            <w:tcW w:w="905" w:type="dxa"/>
+            <w:tcBorders>
+              <w:bottom w:val="single" w:sz="4" w:space="0" w:color="808080"/>
+            </w:tcBorders>
+            <w:shd w:val="clear" w:color="auto" w:fill="E2F0D9"/>
+            <w:tcMar>
+              <w:top w:w="60" w:type="dxa"/>
+              <w:left w:w="80" w:type="dxa"/>
+              <w:bottom w:w="60" w:type="dxa"/>
+              <w:right w:w="80" w:type="dxa"/>
+            </w:tcMar>
+            <w:vAlign w:val="center"/>
+          </w:tcPr>
+          <w:p>
+            <w:pPr>
+              <w:spacing w:after="0" w:line="240" w:lineRule="auto"/>
+              <w:rPr>
+                <w:b/>
+                <w:bCs/>
+                <w:color w:val="1E7B34"/>
+                <w:sz w:val="17"/>
+                <w:szCs w:val="17"/>
+              </w:rPr>
+            </w:pPr>
+            <w:r>
+              <w:rPr>
+                <w:b/>
+                <w:bCs/>
+                <w:color w:val="1E7B34"/>
+                <w:sz w:val="17"/>
+                <w:szCs w:val="17"/>
+              </w:rPr>
+              <w:t>Pasó</w:t>
+            </w:r>
+          </w:p>
+        </w:tc>
+      </w:tr>
+      <w:tr>
+        <w:trPr>
+          <w:cantSplit/>
+        </w:trPr>
+        <w:tc>
+          <w:tcPr>
+            <w:tcW w:w="702" w:type="dxa"/>
+            <w:shd w:val="clear" w:color="auto" w:fill="F2F2F2"/>
+            <w:tcMar>
+              <w:top w:w="60" w:type="dxa"/>
+              <w:left w:w="80" w:type="dxa"/>
+              <w:bottom w:w="60" w:type="dxa"/>
+              <w:right w:w="80" w:type="dxa"/>
+            </w:tcMar>
+            <w:vAlign w:val="center"/>
+          </w:tcPr>
+          <w:p>
+            <w:pPr>
+              <w:spacing w:after="0" w:line="240" w:lineRule="auto"/>
+              <w:rPr>
+                <w:b/>
+                <w:bCs/>
+                <w:sz w:val="17"/>
+                <w:szCs w:val="17"/>
+              </w:rPr>
+            </w:pPr>
+            <w:r>
+              <w:rPr>
+                <w:b/>
+                <w:bCs/>
+                <w:sz w:val="17"/>
+                <w:szCs w:val="17"/>
+              </w:rPr>
+              <w:t>CP-24</w:t>
+            </w:r>
+          </w:p>
+        </w:tc>
+        <w:tc>
+          <w:tcPr>
+            <w:tcW w:w="1305" w:type="dxa"/>
+            <w:shd w:val="clear" w:color="auto" w:fill="F2F2F2"/>
+            <w:tcMar>
+              <w:top w:w="60" w:type="dxa"/>
+              <w:left w:w="80" w:type="dxa"/>
+              <w:bottom w:w="60" w:type="dxa"/>
+              <w:right w:w="80" w:type="dxa"/>
+            </w:tcMar>
+            <w:vAlign w:val="center"/>
+          </w:tcPr>
+          <w:p>
+            <w:pPr>
+              <w:spacing w:after="0" w:line="240" w:lineRule="auto"/>
+              <w:rPr>
+                <w:sz w:val="17"/>
+                <w:szCs w:val="17"/>
+              </w:rPr>
+            </w:pPr>
+            <w:r>
+              <w:rPr>
+                <w:sz w:val="17"/>
+                <w:szCs w:val="17"/>
+              </w:rPr>
+              <w:t>Recepción de un lote vencido (proceso 03)</w:t>
+            </w:r>
+          </w:p>
+        </w:tc>
+        <w:tc>
+          <w:tcPr>
+            <w:tcW w:w="2008" w:type="dxa"/>
+            <w:shd w:val="clear" w:color="auto" w:fill="F2F2F2"/>
+            <w:tcMar>
+              <w:top w:w="60" w:type="dxa"/>
+              <w:left w:w="80" w:type="dxa"/>
+              <w:bottom w:w="60" w:type="dxa"/>
+              <w:right w:w="80" w:type="dxa"/>
+            </w:tcMar>
+            <w:vAlign w:val="center"/>
+          </w:tcPr>
+          <w:p>
+            <w:pPr>
+              <w:spacing w:after="0" w:line="240" w:lineRule="auto"/>
+              <w:rPr>
+                <w:sz w:val="17"/>
+                <w:szCs w:val="17"/>
+              </w:rPr>
+            </w:pPr>
+            <w:r>
+              <w:rPr>
+                <w:sz w:val="17"/>
+                <w:szCs w:val="17"/>
+              </w:rPr>
+              <w:t>Guía con un lote vigente (6 u.) y uno vencido ayer (4 u.); luego la misma guía con un lote que vence hoy (3 u.)</w:t>
+            </w:r>
+          </w:p>
+        </w:tc>
+        <w:tc>
+          <w:tcPr>
+            <w:tcW w:w="2309" w:type="dxa"/>
+            <w:shd w:val="clear" w:color="auto" w:fill="F2F2F2"/>
+            <w:tcMar>
+              <w:top w:w="60" w:type="dxa"/>
+              <w:left w:w="80" w:type="dxa"/>
+              <w:bottom w:w="60" w:type="dxa"/>
+              <w:right w:w="80" w:type="dxa"/>
+            </w:tcMar>
+            <w:vAlign w:val="center"/>
+          </w:tcPr>
+          <w:p>
+            <w:pPr>
+              <w:spacing w:after="0" w:line="240" w:lineRule="auto"/>
+              <w:rPr>
+                <w:sz w:val="17"/>
+                <w:szCs w:val="17"/>
+              </w:rPr>
+            </w:pPr>
+            <w:r>
+              <w:rPr>
+                <w:sz w:val="17"/>
+                <w:szCs w:val="17"/>
+              </w:rPr>
+              <w:t>La guía con el lote vencido se rechaza completa en el controlador, con mensaje claro y sin registros; el lote que vence hoy se recibe (valor límite)</w:t>
+            </w:r>
+          </w:p>
+        </w:tc>
+        <w:tc>
+          <w:tcPr>
+            <w:tcW w:w="2811" w:type="dxa"/>
+            <w:shd w:val="clear" w:color="auto" w:fill="F2F2F2"/>
+            <w:tcMar>
+              <w:top w:w="60" w:type="dxa"/>
+              <w:left w:w="80" w:type="dxa"/>
+              <w:bottom w:w="60" w:type="dxa"/>
+              <w:right w:w="80" w:type="dxa"/>
+            </w:tcMar>
+            <w:vAlign w:val="center"/>
+          </w:tcPr>
+          <w:p>
+            <w:pPr>
+              <w:spacing w:after="0" w:line="240" w:lineRule="auto"/>
+              <w:rPr>
+                <w:sz w:val="17"/>
+                <w:szCs w:val="17"/>
+              </w:rPr>
+            </w:pPr>
+            <w:r>
+              <w:rPr>
+                <w:sz w:val="17"/>
+                <w:szCs w:val="17"/>
+              </w:rPr>
+              <w:t>Rechazo «El lote CP24-VENCIDO … ya está vencido … No se puede recibir.» sin recepción, lotes, movimientos ni stock. Luego se recibe CP24-HOY con 3 u.; stock 3</w:t>
             </w:r>
           </w:p>
         </w:tc>
@@ -4348,6 +5386,30 @@
     </w:p>
     <w:p>
       <w:pPr>
+        <w:pStyle w:val="Prrafodelista"/>
+        <w:numPr>
+          <w:ilvl w:val="0"/>
+          <w:numId w:val="1"/>
+        </w:numPr>
+        <w:spacing w:after="60"/>
+        <w:jc w:val="both"/>
+      </w:pPr>
+      <w:r>
+        <w:rPr>
+          <w:b/>
+          <w:bCs/>
+        </w:rPr>
+        <w:t>CP-20 a CP-24:</w:t>
+      </w:r>
+      <w:r>
+        <w:rPr>
+          <w:bCs/>
+        </w:rPr>
+        <w:t xml:space="preserve"> el docente pidió demostrar el orden de salida de los lotes. CP-07 ya probaba que sale primero el lote que vence antes; CP-20 a CP-23 prueban el desempate por orden de ingreso, los lotes vencidos, los productos sin vencimiento y una venta con varios lotes. CP-24 prueba que no se reciban lotes vencidos, regla que se agregó al controlador (OBS-07).</w:t>
+      </w:r>
+    </w:p>
+    <w:p>
+      <w:pPr>
         <w:pStyle w:val="Ttulo2"/>
       </w:pPr>
       <w:r>
@@ -5863,6 +6925,9 @@
         <w:tc>
           <w:tcPr>
             <w:tcW w:w="1204" w:type="dxa"/>
+            <w:tcBorders>
+              <w:bottom w:val="single" w:sz="4" w:space="0" w:color="808080"/>
+            </w:tcBorders>
             <w:shd w:val="clear" w:color="auto" w:fill="F2F2F2"/>
             <w:tcMar>
               <w:top w:w="60" w:type="dxa"/>
@@ -5896,6 +6961,9 @@
         <w:tc>
           <w:tcPr>
             <w:tcW w:w="1405" w:type="dxa"/>
+            <w:tcBorders>
+              <w:bottom w:val="single" w:sz="4" w:space="0" w:color="808080"/>
+            </w:tcBorders>
             <w:shd w:val="clear" w:color="auto" w:fill="F2F2F2"/>
             <w:tcMar>
               <w:top w:w="60" w:type="dxa"/>
@@ -5925,6 +6993,9 @@
         <w:tc>
           <w:tcPr>
             <w:tcW w:w="1305" w:type="dxa"/>
+            <w:tcBorders>
+              <w:bottom w:val="single" w:sz="4" w:space="0" w:color="808080"/>
+            </w:tcBorders>
             <w:shd w:val="clear" w:color="auto" w:fill="F2F2F2"/>
             <w:tcMar>
               <w:top w:w="60" w:type="dxa"/>
@@ -5954,6 +7025,9 @@
         <w:tc>
           <w:tcPr>
             <w:tcW w:w="1405" w:type="dxa"/>
+            <w:tcBorders>
+              <w:bottom w:val="single" w:sz="4" w:space="0" w:color="808080"/>
+            </w:tcBorders>
             <w:shd w:val="clear" w:color="auto" w:fill="F2F2F2"/>
             <w:tcMar>
               <w:top w:w="60" w:type="dxa"/>
@@ -5983,6 +7057,9 @@
         <w:tc>
           <w:tcPr>
             <w:tcW w:w="4721" w:type="dxa"/>
+            <w:tcBorders>
+              <w:bottom w:val="single" w:sz="4" w:space="0" w:color="808080"/>
+            </w:tcBorders>
             <w:shd w:val="clear" w:color="auto" w:fill="F2F2F2"/>
             <w:tcMar>
               <w:top w:w="60" w:type="dxa"/>
@@ -6006,6 +7083,1005 @@
                 <w:szCs w:val="20"/>
               </w:rPr>
               <w:t>El personal puede anular las ventas de su propio turno abierto, con motivo de una lista y registro de anulaciones (CAM-02). Se agregaron CP-16 a CP-19 y CP-11 usa la firma nueva; los 15 casos anteriores siguen aprobando</w:t>
+            </w:r>
+          </w:p>
+        </w:tc>
+      </w:tr>
+      <w:tr>
+        <w:trPr>
+          <w:cantSplit/>
+        </w:trPr>
+        <w:tc>
+          <w:tcPr>
+            <w:tcW w:w="1204" w:type="dxa"/>
+            <w:tcBorders>
+              <w:bottom w:val="single" w:sz="4" w:space="0" w:color="808080"/>
+            </w:tcBorders>
+            <w:shd w:val="clear" w:color="auto" w:fill="F2F2F2"/>
+            <w:tcMar>
+              <w:top w:w="60" w:type="dxa"/>
+              <w:left w:w="80" w:type="dxa"/>
+              <w:bottom w:w="60" w:type="dxa"/>
+              <w:right w:w="80" w:type="dxa"/>
+            </w:tcMar>
+            <w:vAlign w:val="center"/>
+          </w:tcPr>
+          <w:p>
+            <w:pPr>
+              <w:spacing w:after="0" w:line="240" w:lineRule="auto"/>
+              <w:rPr>
+                <w:b/>
+                <w:bCs/>
+                <w:sz w:val="20"/>
+                <w:szCs w:val="20"/>
+              </w:rPr>
+            </w:pPr>
+            <w:r>
+              <w:rPr>
+                <w:b/>
+                <w:bCs/>
+                <w:sz w:val="20"/>
+                <w:szCs w:val="20"/>
+              </w:rPr>
+              <w:t>Corrida 11</w:t>
+            </w:r>
+          </w:p>
+        </w:tc>
+        <w:tc>
+          <w:tcPr>
+            <w:tcW w:w="1405" w:type="dxa"/>
+            <w:tcBorders>
+              <w:bottom w:val="single" w:sz="4" w:space="0" w:color="808080"/>
+            </w:tcBorders>
+            <w:shd w:val="clear" w:color="auto" w:fill="F2F2F2"/>
+            <w:tcMar>
+              <w:top w:w="60" w:type="dxa"/>
+              <w:left w:w="80" w:type="dxa"/>
+              <w:bottom w:w="60" w:type="dxa"/>
+              <w:right w:w="80" w:type="dxa"/>
+            </w:tcMar>
+            <w:vAlign w:val="center"/>
+          </w:tcPr>
+          <w:p>
+            <w:pPr>
+              <w:spacing w:after="0" w:line="240" w:lineRule="auto"/>
+              <w:rPr>
+                <w:sz w:val="20"/>
+                <w:szCs w:val="20"/>
+              </w:rPr>
+            </w:pPr>
+            <w:r>
+              <w:rPr>
+                <w:sz w:val="20"/>
+                <w:szCs w:val="20"/>
+              </w:rPr>
+              <w:t>19/19</w:t>
+            </w:r>
+          </w:p>
+        </w:tc>
+        <w:tc>
+          <w:tcPr>
+            <w:tcW w:w="1305" w:type="dxa"/>
+            <w:tcBorders>
+              <w:bottom w:val="single" w:sz="4" w:space="0" w:color="808080"/>
+            </w:tcBorders>
+            <w:shd w:val="clear" w:color="auto" w:fill="F2F2F2"/>
+            <w:tcMar>
+              <w:top w:w="60" w:type="dxa"/>
+              <w:left w:w="80" w:type="dxa"/>
+              <w:bottom w:w="60" w:type="dxa"/>
+              <w:right w:w="80" w:type="dxa"/>
+            </w:tcMar>
+            <w:vAlign w:val="center"/>
+          </w:tcPr>
+          <w:p>
+            <w:pPr>
+              <w:spacing w:after="0" w:line="240" w:lineRule="auto"/>
+              <w:rPr>
+                <w:sz w:val="20"/>
+                <w:szCs w:val="20"/>
+              </w:rPr>
+            </w:pPr>
+            <w:r>
+              <w:rPr>
+                <w:sz w:val="20"/>
+                <w:szCs w:val="20"/>
+              </w:rPr>
+              <w:t>100 %</w:t>
+            </w:r>
+          </w:p>
+        </w:tc>
+        <w:tc>
+          <w:tcPr>
+            <w:tcW w:w="1405" w:type="dxa"/>
+            <w:tcBorders>
+              <w:bottom w:val="single" w:sz="4" w:space="0" w:color="808080"/>
+            </w:tcBorders>
+            <w:shd w:val="clear" w:color="auto" w:fill="F2F2F2"/>
+            <w:tcMar>
+              <w:top w:w="60" w:type="dxa"/>
+              <w:left w:w="80" w:type="dxa"/>
+              <w:bottom w:w="60" w:type="dxa"/>
+              <w:right w:w="80" w:type="dxa"/>
+            </w:tcMar>
+            <w:vAlign w:val="center"/>
+          </w:tcPr>
+          <w:p>
+            <w:pPr>
+              <w:spacing w:after="0" w:line="240" w:lineRule="auto"/>
+              <w:rPr>
+                <w:sz w:val="20"/>
+                <w:szCs w:val="20"/>
+              </w:rPr>
+            </w:pPr>
+            <w:r>
+              <w:rPr>
+                <w:sz w:val="20"/>
+                <w:szCs w:val="20"/>
+              </w:rPr>
+              <w:t>Ninguno</w:t>
+            </w:r>
+          </w:p>
+        </w:tc>
+        <w:tc>
+          <w:tcPr>
+            <w:tcW w:w="4721" w:type="dxa"/>
+            <w:tcBorders>
+              <w:bottom w:val="single" w:sz="4" w:space="0" w:color="808080"/>
+            </w:tcBorders>
+            <w:shd w:val="clear" w:color="auto" w:fill="F2F2F2"/>
+            <w:tcMar>
+              <w:top w:w="60" w:type="dxa"/>
+              <w:left w:w="80" w:type="dxa"/>
+              <w:bottom w:w="60" w:type="dxa"/>
+              <w:right w:w="80" w:type="dxa"/>
+            </w:tcMar>
+            <w:vAlign w:val="center"/>
+          </w:tcPr>
+          <w:p>
+            <w:pPr>
+              <w:spacing w:after="0" w:line="240" w:lineRule="auto"/>
+              <w:rPr>
+                <w:sz w:val="20"/>
+                <w:szCs w:val="20"/>
+              </w:rPr>
+            </w:pPr>
+            <w:r>
+              <w:rPr>
+                <w:sz w:val="20"/>
+                <w:szCs w:val="20"/>
+              </w:rPr>
+              <w:t>Regresión tras corregir el texto de Caja en la cabecera (solo cambió un texto de la vista)</w:t>
+            </w:r>
+          </w:p>
+        </w:tc>
+      </w:tr>
+      <w:tr>
+        <w:trPr>
+          <w:cantSplit/>
+        </w:trPr>
+        <w:tc>
+          <w:tcPr>
+            <w:tcW w:w="1204" w:type="dxa"/>
+            <w:tcBorders>
+              <w:bottom w:val="single" w:sz="4" w:space="0" w:color="808080"/>
+            </w:tcBorders>
+            <w:shd w:val="clear" w:color="auto" w:fill="F2F2F2"/>
+            <w:tcMar>
+              <w:top w:w="60" w:type="dxa"/>
+              <w:left w:w="80" w:type="dxa"/>
+              <w:bottom w:w="60" w:type="dxa"/>
+              <w:right w:w="80" w:type="dxa"/>
+            </w:tcMar>
+            <w:vAlign w:val="center"/>
+          </w:tcPr>
+          <w:p>
+            <w:pPr>
+              <w:spacing w:after="0" w:line="240" w:lineRule="auto"/>
+              <w:rPr>
+                <w:b/>
+                <w:bCs/>
+                <w:sz w:val="20"/>
+                <w:szCs w:val="20"/>
+              </w:rPr>
+            </w:pPr>
+            <w:r>
+              <w:rPr>
+                <w:b/>
+                <w:bCs/>
+                <w:sz w:val="20"/>
+                <w:szCs w:val="20"/>
+              </w:rPr>
+              <w:t>Corrida 12</w:t>
+            </w:r>
+          </w:p>
+        </w:tc>
+        <w:tc>
+          <w:tcPr>
+            <w:tcW w:w="1405" w:type="dxa"/>
+            <w:tcBorders>
+              <w:bottom w:val="single" w:sz="4" w:space="0" w:color="808080"/>
+            </w:tcBorders>
+            <w:shd w:val="clear" w:color="auto" w:fill="F2F2F2"/>
+            <w:tcMar>
+              <w:top w:w="60" w:type="dxa"/>
+              <w:left w:w="80" w:type="dxa"/>
+              <w:bottom w:w="60" w:type="dxa"/>
+              <w:right w:w="80" w:type="dxa"/>
+            </w:tcMar>
+            <w:vAlign w:val="center"/>
+          </w:tcPr>
+          <w:p>
+            <w:pPr>
+              <w:spacing w:after="0" w:line="240" w:lineRule="auto"/>
+              <w:rPr>
+                <w:sz w:val="20"/>
+                <w:szCs w:val="20"/>
+              </w:rPr>
+            </w:pPr>
+            <w:r>
+              <w:rPr>
+                <w:sz w:val="20"/>
+                <w:szCs w:val="20"/>
+              </w:rPr>
+              <w:t>23/23</w:t>
+            </w:r>
+          </w:p>
+        </w:tc>
+        <w:tc>
+          <w:tcPr>
+            <w:tcW w:w="1305" w:type="dxa"/>
+            <w:tcBorders>
+              <w:bottom w:val="single" w:sz="4" w:space="0" w:color="808080"/>
+            </w:tcBorders>
+            <w:shd w:val="clear" w:color="auto" w:fill="F2F2F2"/>
+            <w:tcMar>
+              <w:top w:w="60" w:type="dxa"/>
+              <w:left w:w="80" w:type="dxa"/>
+              <w:bottom w:w="60" w:type="dxa"/>
+              <w:right w:w="80" w:type="dxa"/>
+            </w:tcMar>
+            <w:vAlign w:val="center"/>
+          </w:tcPr>
+          <w:p>
+            <w:pPr>
+              <w:spacing w:after="0" w:line="240" w:lineRule="auto"/>
+              <w:rPr>
+                <w:sz w:val="20"/>
+                <w:szCs w:val="20"/>
+              </w:rPr>
+            </w:pPr>
+            <w:r>
+              <w:rPr>
+                <w:sz w:val="20"/>
+                <w:szCs w:val="20"/>
+              </w:rPr>
+              <w:t>100 %</w:t>
+            </w:r>
+          </w:p>
+        </w:tc>
+        <w:tc>
+          <w:tcPr>
+            <w:tcW w:w="1405" w:type="dxa"/>
+            <w:tcBorders>
+              <w:bottom w:val="single" w:sz="4" w:space="0" w:color="808080"/>
+            </w:tcBorders>
+            <w:shd w:val="clear" w:color="auto" w:fill="F2F2F2"/>
+            <w:tcMar>
+              <w:top w:w="60" w:type="dxa"/>
+              <w:left w:w="80" w:type="dxa"/>
+              <w:bottom w:w="60" w:type="dxa"/>
+              <w:right w:w="80" w:type="dxa"/>
+            </w:tcMar>
+            <w:vAlign w:val="center"/>
+          </w:tcPr>
+          <w:p>
+            <w:pPr>
+              <w:spacing w:after="0" w:line="240" w:lineRule="auto"/>
+              <w:rPr>
+                <w:sz w:val="20"/>
+                <w:szCs w:val="20"/>
+              </w:rPr>
+            </w:pPr>
+            <w:r>
+              <w:rPr>
+                <w:sz w:val="20"/>
+                <w:szCs w:val="20"/>
+              </w:rPr>
+              <w:t>Ninguno</w:t>
+            </w:r>
+          </w:p>
+        </w:tc>
+        <w:tc>
+          <w:tcPr>
+            <w:tcW w:w="4721" w:type="dxa"/>
+            <w:tcBorders>
+              <w:bottom w:val="single" w:sz="4" w:space="0" w:color="808080"/>
+            </w:tcBorders>
+            <w:shd w:val="clear" w:color="auto" w:fill="F2F2F2"/>
+            <w:tcMar>
+              <w:top w:w="60" w:type="dxa"/>
+              <w:left w:w="80" w:type="dxa"/>
+              <w:bottom w:w="60" w:type="dxa"/>
+              <w:right w:w="80" w:type="dxa"/>
+            </w:tcMar>
+            <w:vAlign w:val="center"/>
+          </w:tcPr>
+          <w:p>
+            <w:pPr>
+              <w:spacing w:after="0" w:line="240" w:lineRule="auto"/>
+              <w:rPr>
+                <w:sz w:val="20"/>
+                <w:szCs w:val="20"/>
+              </w:rPr>
+            </w:pPr>
+            <w:r>
+              <w:rPr>
+                <w:sz w:val="20"/>
+                <w:szCs w:val="20"/>
+              </w:rPr>
+              <w:t>Se agregaron CP-20 a CP-23 sobre el orden de salida de los lotes. El código ya cumplía las reglas y no cambió</w:t>
+            </w:r>
+          </w:p>
+        </w:tc>
+      </w:tr>
+      <w:tr>
+        <w:trPr>
+          <w:cantSplit/>
+        </w:trPr>
+        <w:tc>
+          <w:tcPr>
+            <w:tcW w:w="1204" w:type="dxa"/>
+            <w:tcBorders>
+              <w:bottom w:val="single" w:sz="4" w:space="0" w:color="808080"/>
+            </w:tcBorders>
+            <w:shd w:val="clear" w:color="auto" w:fill="F2F2F2"/>
+            <w:tcMar>
+              <w:top w:w="60" w:type="dxa"/>
+              <w:left w:w="80" w:type="dxa"/>
+              <w:bottom w:w="60" w:type="dxa"/>
+              <w:right w:w="80" w:type="dxa"/>
+            </w:tcMar>
+            <w:vAlign w:val="center"/>
+          </w:tcPr>
+          <w:p>
+            <w:pPr>
+              <w:spacing w:after="0" w:line="240" w:lineRule="auto"/>
+              <w:rPr>
+                <w:b/>
+                <w:bCs/>
+                <w:sz w:val="20"/>
+                <w:szCs w:val="20"/>
+              </w:rPr>
+            </w:pPr>
+            <w:r>
+              <w:rPr>
+                <w:b/>
+                <w:bCs/>
+                <w:sz w:val="20"/>
+                <w:szCs w:val="20"/>
+              </w:rPr>
+              <w:t>Corrida 13</w:t>
+            </w:r>
+          </w:p>
+        </w:tc>
+        <w:tc>
+          <w:tcPr>
+            <w:tcW w:w="1405" w:type="dxa"/>
+            <w:tcBorders>
+              <w:bottom w:val="single" w:sz="4" w:space="0" w:color="808080"/>
+            </w:tcBorders>
+            <w:shd w:val="clear" w:color="auto" w:fill="F2F2F2"/>
+            <w:tcMar>
+              <w:top w:w="60" w:type="dxa"/>
+              <w:left w:w="80" w:type="dxa"/>
+              <w:bottom w:w="60" w:type="dxa"/>
+              <w:right w:w="80" w:type="dxa"/>
+            </w:tcMar>
+            <w:vAlign w:val="center"/>
+          </w:tcPr>
+          <w:p>
+            <w:pPr>
+              <w:spacing w:after="0" w:line="240" w:lineRule="auto"/>
+              <w:rPr>
+                <w:sz w:val="20"/>
+                <w:szCs w:val="20"/>
+              </w:rPr>
+            </w:pPr>
+            <w:r>
+              <w:rPr>
+                <w:sz w:val="20"/>
+                <w:szCs w:val="20"/>
+              </w:rPr>
+              <w:t>23/24</w:t>
+            </w:r>
+          </w:p>
+        </w:tc>
+        <w:tc>
+          <w:tcPr>
+            <w:tcW w:w="1305" w:type="dxa"/>
+            <w:tcBorders>
+              <w:bottom w:val="single" w:sz="4" w:space="0" w:color="808080"/>
+            </w:tcBorders>
+            <w:shd w:val="clear" w:color="auto" w:fill="F2F2F2"/>
+            <w:tcMar>
+              <w:top w:w="60" w:type="dxa"/>
+              <w:left w:w="80" w:type="dxa"/>
+              <w:bottom w:w="60" w:type="dxa"/>
+              <w:right w:w="80" w:type="dxa"/>
+            </w:tcMar>
+            <w:vAlign w:val="center"/>
+          </w:tcPr>
+          <w:p>
+            <w:pPr>
+              <w:spacing w:after="0" w:line="240" w:lineRule="auto"/>
+              <w:rPr>
+                <w:sz w:val="20"/>
+                <w:szCs w:val="20"/>
+              </w:rPr>
+            </w:pPr>
+            <w:r>
+              <w:rPr>
+                <w:sz w:val="20"/>
+                <w:szCs w:val="20"/>
+              </w:rPr>
+              <w:t>95,8 %</w:t>
+            </w:r>
+          </w:p>
+        </w:tc>
+        <w:tc>
+          <w:tcPr>
+            <w:tcW w:w="1405" w:type="dxa"/>
+            <w:tcBorders>
+              <w:bottom w:val="single" w:sz="4" w:space="0" w:color="808080"/>
+            </w:tcBorders>
+            <w:shd w:val="clear" w:color="auto" w:fill="F2F2F2"/>
+            <w:tcMar>
+              <w:top w:w="60" w:type="dxa"/>
+              <w:left w:w="80" w:type="dxa"/>
+              <w:bottom w:w="60" w:type="dxa"/>
+              <w:right w:w="80" w:type="dxa"/>
+            </w:tcMar>
+            <w:vAlign w:val="center"/>
+          </w:tcPr>
+          <w:p>
+            <w:pPr>
+              <w:spacing w:after="0" w:line="240" w:lineRule="auto"/>
+              <w:rPr>
+                <w:sz w:val="20"/>
+                <w:szCs w:val="20"/>
+              </w:rPr>
+            </w:pPr>
+            <w:r>
+              <w:rPr>
+                <w:sz w:val="20"/>
+                <w:szCs w:val="20"/>
+              </w:rPr>
+              <w:t>CP-15 (limpieza)</w:t>
+            </w:r>
+          </w:p>
+        </w:tc>
+        <w:tc>
+          <w:tcPr>
+            <w:tcW w:w="4721" w:type="dxa"/>
+            <w:tcBorders>
+              <w:bottom w:val="single" w:sz="4" w:space="0" w:color="808080"/>
+            </w:tcBorders>
+            <w:shd w:val="clear" w:color="auto" w:fill="F2F2F2"/>
+            <w:tcMar>
+              <w:top w:w="60" w:type="dxa"/>
+              <w:left w:w="80" w:type="dxa"/>
+              <w:bottom w:w="60" w:type="dxa"/>
+              <w:right w:w="80" w:type="dxa"/>
+            </w:tcMar>
+            <w:vAlign w:val="center"/>
+          </w:tcPr>
+          <w:p>
+            <w:pPr>
+              <w:spacing w:after="0" w:line="240" w:lineRule="auto"/>
+              <w:rPr>
+                <w:sz w:val="20"/>
+                <w:szCs w:val="20"/>
+              </w:rPr>
+            </w:pPr>
+            <w:r>
+              <w:rPr>
+                <w:sz w:val="20"/>
+                <w:szCs w:val="20"/>
+              </w:rPr>
+              <w:t>El controlador rechaza la recepción de lotes vencidos (OBS-07) y se agregó CP-24, que pasa. CP-15 pasó sus verificaciones, pero JUnit no pudo borrar su carpeta temporal</w:t>
+            </w:r>
+          </w:p>
+        </w:tc>
+      </w:tr>
+      <w:tr>
+        <w:trPr>
+          <w:cantSplit/>
+        </w:trPr>
+        <w:tc>
+          <w:tcPr>
+            <w:tcW w:w="1204" w:type="dxa"/>
+            <w:tcBorders>
+              <w:bottom w:val="single" w:sz="4" w:space="0" w:color="808080"/>
+            </w:tcBorders>
+            <w:shd w:val="clear" w:color="auto" w:fill="F2F2F2"/>
+            <w:tcMar>
+              <w:top w:w="60" w:type="dxa"/>
+              <w:left w:w="80" w:type="dxa"/>
+              <w:bottom w:w="60" w:type="dxa"/>
+              <w:right w:w="80" w:type="dxa"/>
+            </w:tcMar>
+            <w:vAlign w:val="center"/>
+          </w:tcPr>
+          <w:p>
+            <w:pPr>
+              <w:spacing w:after="0" w:line="240" w:lineRule="auto"/>
+              <w:rPr>
+                <w:b/>
+                <w:bCs/>
+                <w:sz w:val="20"/>
+                <w:szCs w:val="20"/>
+              </w:rPr>
+            </w:pPr>
+            <w:r>
+              <w:rPr>
+                <w:b/>
+                <w:bCs/>
+                <w:sz w:val="20"/>
+                <w:szCs w:val="20"/>
+              </w:rPr>
+              <w:t>Corrida 14</w:t>
+            </w:r>
+          </w:p>
+        </w:tc>
+        <w:tc>
+          <w:tcPr>
+            <w:tcW w:w="1405" w:type="dxa"/>
+            <w:tcBorders>
+              <w:bottom w:val="single" w:sz="4" w:space="0" w:color="808080"/>
+            </w:tcBorders>
+            <w:shd w:val="clear" w:color="auto" w:fill="F2F2F2"/>
+            <w:tcMar>
+              <w:top w:w="60" w:type="dxa"/>
+              <w:left w:w="80" w:type="dxa"/>
+              <w:bottom w:w="60" w:type="dxa"/>
+              <w:right w:w="80" w:type="dxa"/>
+            </w:tcMar>
+            <w:vAlign w:val="center"/>
+          </w:tcPr>
+          <w:p>
+            <w:pPr>
+              <w:spacing w:after="0" w:line="240" w:lineRule="auto"/>
+              <w:rPr>
+                <w:sz w:val="20"/>
+                <w:szCs w:val="20"/>
+              </w:rPr>
+            </w:pPr>
+            <w:r>
+              <w:rPr>
+                <w:sz w:val="20"/>
+                <w:szCs w:val="20"/>
+              </w:rPr>
+              <w:t>23/24</w:t>
+            </w:r>
+          </w:p>
+        </w:tc>
+        <w:tc>
+          <w:tcPr>
+            <w:tcW w:w="1305" w:type="dxa"/>
+            <w:tcBorders>
+              <w:bottom w:val="single" w:sz="4" w:space="0" w:color="808080"/>
+            </w:tcBorders>
+            <w:shd w:val="clear" w:color="auto" w:fill="F2F2F2"/>
+            <w:tcMar>
+              <w:top w:w="60" w:type="dxa"/>
+              <w:left w:w="80" w:type="dxa"/>
+              <w:bottom w:w="60" w:type="dxa"/>
+              <w:right w:w="80" w:type="dxa"/>
+            </w:tcMar>
+            <w:vAlign w:val="center"/>
+          </w:tcPr>
+          <w:p>
+            <w:pPr>
+              <w:spacing w:after="0" w:line="240" w:lineRule="auto"/>
+              <w:rPr>
+                <w:sz w:val="20"/>
+                <w:szCs w:val="20"/>
+              </w:rPr>
+            </w:pPr>
+            <w:r>
+              <w:rPr>
+                <w:sz w:val="20"/>
+                <w:szCs w:val="20"/>
+              </w:rPr>
+              <w:t>95,8 %</w:t>
+            </w:r>
+          </w:p>
+        </w:tc>
+        <w:tc>
+          <w:tcPr>
+            <w:tcW w:w="1405" w:type="dxa"/>
+            <w:tcBorders>
+              <w:bottom w:val="single" w:sz="4" w:space="0" w:color="808080"/>
+            </w:tcBorders>
+            <w:shd w:val="clear" w:color="auto" w:fill="F2F2F2"/>
+            <w:tcMar>
+              <w:top w:w="60" w:type="dxa"/>
+              <w:left w:w="80" w:type="dxa"/>
+              <w:bottom w:w="60" w:type="dxa"/>
+              <w:right w:w="80" w:type="dxa"/>
+            </w:tcMar>
+            <w:vAlign w:val="center"/>
+          </w:tcPr>
+          <w:p>
+            <w:pPr>
+              <w:spacing w:after="0" w:line="240" w:lineRule="auto"/>
+              <w:rPr>
+                <w:sz w:val="20"/>
+                <w:szCs w:val="20"/>
+              </w:rPr>
+            </w:pPr>
+            <w:r>
+              <w:rPr>
+                <w:sz w:val="20"/>
+                <w:szCs w:val="20"/>
+              </w:rPr>
+              <w:t>CP-15 (limpieza)</w:t>
+            </w:r>
+          </w:p>
+        </w:tc>
+        <w:tc>
+          <w:tcPr>
+            <w:tcW w:w="4721" w:type="dxa"/>
+            <w:tcBorders>
+              <w:bottom w:val="single" w:sz="4" w:space="0" w:color="808080"/>
+            </w:tcBorders>
+            <w:shd w:val="clear" w:color="auto" w:fill="F2F2F2"/>
+            <w:tcMar>
+              <w:top w:w="60" w:type="dxa"/>
+              <w:left w:w="80" w:type="dxa"/>
+              <w:bottom w:w="60" w:type="dxa"/>
+              <w:right w:w="80" w:type="dxa"/>
+            </w:tcMar>
+            <w:vAlign w:val="center"/>
+          </w:tcPr>
+          <w:p>
+            <w:pPr>
+              <w:spacing w:after="0" w:line="240" w:lineRule="auto"/>
+              <w:rPr>
+                <w:sz w:val="20"/>
+                <w:szCs w:val="20"/>
+              </w:rPr>
+            </w:pPr>
+            <w:r>
+              <w:rPr>
+                <w:sz w:val="20"/>
+                <w:szCs w:val="20"/>
+              </w:rPr>
+              <w:t>Repetición de la corrida 13 sin cambios; el mismo fallo de CP-15</w:t>
+            </w:r>
+          </w:p>
+        </w:tc>
+      </w:tr>
+      <w:tr>
+        <w:trPr>
+          <w:cantSplit/>
+        </w:trPr>
+        <w:tc>
+          <w:tcPr>
+            <w:tcW w:w="1204" w:type="dxa"/>
+            <w:tcBorders>
+              <w:bottom w:val="single" w:sz="4" w:space="0" w:color="808080"/>
+            </w:tcBorders>
+            <w:shd w:val="clear" w:color="auto" w:fill="F2F2F2"/>
+            <w:tcMar>
+              <w:top w:w="60" w:type="dxa"/>
+              <w:left w:w="80" w:type="dxa"/>
+              <w:bottom w:w="60" w:type="dxa"/>
+              <w:right w:w="80" w:type="dxa"/>
+            </w:tcMar>
+            <w:vAlign w:val="center"/>
+          </w:tcPr>
+          <w:p>
+            <w:pPr>
+              <w:spacing w:after="0" w:line="240" w:lineRule="auto"/>
+              <w:rPr>
+                <w:b/>
+                <w:bCs/>
+                <w:sz w:val="20"/>
+                <w:szCs w:val="20"/>
+              </w:rPr>
+            </w:pPr>
+            <w:r>
+              <w:rPr>
+                <w:b/>
+                <w:bCs/>
+                <w:sz w:val="20"/>
+                <w:szCs w:val="20"/>
+              </w:rPr>
+              <w:t>Corrida 15</w:t>
+            </w:r>
+          </w:p>
+        </w:tc>
+        <w:tc>
+          <w:tcPr>
+            <w:tcW w:w="1405" w:type="dxa"/>
+            <w:tcBorders>
+              <w:bottom w:val="single" w:sz="4" w:space="0" w:color="808080"/>
+            </w:tcBorders>
+            <w:shd w:val="clear" w:color="auto" w:fill="F2F2F2"/>
+            <w:tcMar>
+              <w:top w:w="60" w:type="dxa"/>
+              <w:left w:w="80" w:type="dxa"/>
+              <w:bottom w:w="60" w:type="dxa"/>
+              <w:right w:w="80" w:type="dxa"/>
+            </w:tcMar>
+            <w:vAlign w:val="center"/>
+          </w:tcPr>
+          <w:p>
+            <w:pPr>
+              <w:spacing w:after="0" w:line="240" w:lineRule="auto"/>
+              <w:rPr>
+                <w:sz w:val="20"/>
+                <w:szCs w:val="20"/>
+              </w:rPr>
+            </w:pPr>
+            <w:r>
+              <w:rPr>
+                <w:sz w:val="20"/>
+                <w:szCs w:val="20"/>
+              </w:rPr>
+              <w:t>23/24</w:t>
+            </w:r>
+          </w:p>
+        </w:tc>
+        <w:tc>
+          <w:tcPr>
+            <w:tcW w:w="1305" w:type="dxa"/>
+            <w:tcBorders>
+              <w:bottom w:val="single" w:sz="4" w:space="0" w:color="808080"/>
+            </w:tcBorders>
+            <w:shd w:val="clear" w:color="auto" w:fill="F2F2F2"/>
+            <w:tcMar>
+              <w:top w:w="60" w:type="dxa"/>
+              <w:left w:w="80" w:type="dxa"/>
+              <w:bottom w:w="60" w:type="dxa"/>
+              <w:right w:w="80" w:type="dxa"/>
+            </w:tcMar>
+            <w:vAlign w:val="center"/>
+          </w:tcPr>
+          <w:p>
+            <w:pPr>
+              <w:spacing w:after="0" w:line="240" w:lineRule="auto"/>
+              <w:rPr>
+                <w:sz w:val="20"/>
+                <w:szCs w:val="20"/>
+              </w:rPr>
+            </w:pPr>
+            <w:r>
+              <w:rPr>
+                <w:sz w:val="20"/>
+                <w:szCs w:val="20"/>
+              </w:rPr>
+              <w:t>95,8 %</w:t>
+            </w:r>
+          </w:p>
+        </w:tc>
+        <w:tc>
+          <w:tcPr>
+            <w:tcW w:w="1405" w:type="dxa"/>
+            <w:tcBorders>
+              <w:bottom w:val="single" w:sz="4" w:space="0" w:color="808080"/>
+            </w:tcBorders>
+            <w:shd w:val="clear" w:color="auto" w:fill="F2F2F2"/>
+            <w:tcMar>
+              <w:top w:w="60" w:type="dxa"/>
+              <w:left w:w="80" w:type="dxa"/>
+              <w:bottom w:w="60" w:type="dxa"/>
+              <w:right w:w="80" w:type="dxa"/>
+            </w:tcMar>
+            <w:vAlign w:val="center"/>
+          </w:tcPr>
+          <w:p>
+            <w:pPr>
+              <w:spacing w:after="0" w:line="240" w:lineRule="auto"/>
+              <w:rPr>
+                <w:sz w:val="20"/>
+                <w:szCs w:val="20"/>
+              </w:rPr>
+            </w:pPr>
+            <w:r>
+              <w:rPr>
+                <w:sz w:val="20"/>
+                <w:szCs w:val="20"/>
+              </w:rPr>
+              <w:t>CP-15 (limpieza)</w:t>
+            </w:r>
+          </w:p>
+        </w:tc>
+        <w:tc>
+          <w:tcPr>
+            <w:tcW w:w="4721" w:type="dxa"/>
+            <w:tcBorders>
+              <w:bottom w:val="single" w:sz="4" w:space="0" w:color="808080"/>
+            </w:tcBorders>
+            <w:shd w:val="clear" w:color="auto" w:fill="F2F2F2"/>
+            <w:tcMar>
+              <w:top w:w="60" w:type="dxa"/>
+              <w:left w:w="80" w:type="dxa"/>
+              <w:bottom w:w="60" w:type="dxa"/>
+              <w:right w:w="80" w:type="dxa"/>
+            </w:tcMar>
+            <w:vAlign w:val="center"/>
+          </w:tcPr>
+          <w:p>
+            <w:pPr>
+              <w:spacing w:after="0" w:line="240" w:lineRule="auto"/>
+              <w:rPr>
+                <w:sz w:val="20"/>
+                <w:szCs w:val="20"/>
+              </w:rPr>
+            </w:pPr>
+            <w:r>
+              <w:rPr>
+                <w:sz w:val="20"/>
+                <w:szCs w:val="20"/>
+              </w:rPr>
+              <w:t>CP-15 reintentó borrar sus archivos durante 10 s y el PDF siguió bloqueado: no era un bloqueo breve de otro proceso</w:t>
+            </w:r>
+          </w:p>
+        </w:tc>
+      </w:tr>
+      <w:tr>
+        <w:trPr>
+          <w:cantSplit/>
+        </w:trPr>
+        <w:tc>
+          <w:tcPr>
+            <w:tcW w:w="1204" w:type="dxa"/>
+            <w:shd w:val="clear" w:color="auto" w:fill="F2F2F2"/>
+            <w:tcMar>
+              <w:top w:w="60" w:type="dxa"/>
+              <w:left w:w="80" w:type="dxa"/>
+              <w:bottom w:w="60" w:type="dxa"/>
+              <w:right w:w="80" w:type="dxa"/>
+            </w:tcMar>
+            <w:vAlign w:val="center"/>
+          </w:tcPr>
+          <w:p>
+            <w:pPr>
+              <w:spacing w:after="0" w:line="240" w:lineRule="auto"/>
+              <w:rPr>
+                <w:b/>
+                <w:bCs/>
+                <w:sz w:val="20"/>
+                <w:szCs w:val="20"/>
+              </w:rPr>
+            </w:pPr>
+            <w:r>
+              <w:rPr>
+                <w:b/>
+                <w:bCs/>
+                <w:sz w:val="20"/>
+                <w:szCs w:val="20"/>
+              </w:rPr>
+              <w:t>Corrida 16</w:t>
+            </w:r>
+          </w:p>
+        </w:tc>
+        <w:tc>
+          <w:tcPr>
+            <w:tcW w:w="1405" w:type="dxa"/>
+            <w:shd w:val="clear" w:color="auto" w:fill="F2F2F2"/>
+            <w:tcMar>
+              <w:top w:w="60" w:type="dxa"/>
+              <w:left w:w="80" w:type="dxa"/>
+              <w:bottom w:w="60" w:type="dxa"/>
+              <w:right w:w="80" w:type="dxa"/>
+            </w:tcMar>
+            <w:vAlign w:val="center"/>
+          </w:tcPr>
+          <w:p>
+            <w:pPr>
+              <w:spacing w:after="0" w:line="240" w:lineRule="auto"/>
+              <w:rPr>
+                <w:sz w:val="20"/>
+                <w:szCs w:val="20"/>
+              </w:rPr>
+            </w:pPr>
+            <w:r>
+              <w:rPr>
+                <w:sz w:val="20"/>
+                <w:szCs w:val="20"/>
+              </w:rPr>
+              <w:t>24/24</w:t>
+            </w:r>
+          </w:p>
+        </w:tc>
+        <w:tc>
+          <w:tcPr>
+            <w:tcW w:w="1305" w:type="dxa"/>
+            <w:shd w:val="clear" w:color="auto" w:fill="F2F2F2"/>
+            <w:tcMar>
+              <w:top w:w="60" w:type="dxa"/>
+              <w:left w:w="80" w:type="dxa"/>
+              <w:bottom w:w="60" w:type="dxa"/>
+              <w:right w:w="80" w:type="dxa"/>
+            </w:tcMar>
+            <w:vAlign w:val="center"/>
+          </w:tcPr>
+          <w:p>
+            <w:pPr>
+              <w:spacing w:after="0" w:line="240" w:lineRule="auto"/>
+              <w:rPr>
+                <w:sz w:val="20"/>
+                <w:szCs w:val="20"/>
+              </w:rPr>
+            </w:pPr>
+            <w:r>
+              <w:rPr>
+                <w:sz w:val="20"/>
+                <w:szCs w:val="20"/>
+              </w:rPr>
+              <w:t>100 %</w:t>
+            </w:r>
+          </w:p>
+        </w:tc>
+        <w:tc>
+          <w:tcPr>
+            <w:tcW w:w="1405" w:type="dxa"/>
+            <w:shd w:val="clear" w:color="auto" w:fill="F2F2F2"/>
+            <w:tcMar>
+              <w:top w:w="60" w:type="dxa"/>
+              <w:left w:w="80" w:type="dxa"/>
+              <w:bottom w:w="60" w:type="dxa"/>
+              <w:right w:w="80" w:type="dxa"/>
+            </w:tcMar>
+            <w:vAlign w:val="center"/>
+          </w:tcPr>
+          <w:p>
+            <w:pPr>
+              <w:spacing w:after="0" w:line="240" w:lineRule="auto"/>
+              <w:rPr>
+                <w:sz w:val="20"/>
+                <w:szCs w:val="20"/>
+              </w:rPr>
+            </w:pPr>
+            <w:r>
+              <w:rPr>
+                <w:sz w:val="20"/>
+                <w:szCs w:val="20"/>
+              </w:rPr>
+              <w:t>Ninguno</w:t>
+            </w:r>
+          </w:p>
+        </w:tc>
+        <w:tc>
+          <w:tcPr>
+            <w:tcW w:w="4721" w:type="dxa"/>
+            <w:shd w:val="clear" w:color="auto" w:fill="F2F2F2"/>
+            <w:tcMar>
+              <w:top w:w="60" w:type="dxa"/>
+              <w:left w:w="80" w:type="dxa"/>
+              <w:bottom w:w="60" w:type="dxa"/>
+              <w:right w:w="80" w:type="dxa"/>
+            </w:tcMar>
+            <w:vAlign w:val="center"/>
+          </w:tcPr>
+          <w:p>
+            <w:pPr>
+              <w:spacing w:after="0" w:line="240" w:lineRule="auto"/>
+              <w:rPr>
+                <w:sz w:val="20"/>
+                <w:szCs w:val="20"/>
+              </w:rPr>
+            </w:pPr>
+            <w:r>
+              <w:rPr>
+                <w:sz w:val="20"/>
+                <w:szCs w:val="20"/>
+              </w:rPr>
+              <w:t>CP-15 lee el PDF desde sus bytes (OBS-08: la prueba lo mapeaba en memoria). Los 24 casos aprueban</w:t>
             </w:r>
           </w:p>
         </w:tc>
@@ -6017,10 +8093,7 @@
         <w:jc w:val="both"/>
       </w:pPr>
       <w:r>
-        <w:t xml:space="preserve">Estado por corrida de los casos que cambiaron </w:t>
-      </w:r>
-      <w:r>
-        <w:t>(los otros 12 casos pasaron en las diez corridas; CP-16 a CP-19 se agregaron en la corrida 10 y pasaron)</w:t>
+        <w:t>Estado por corrida (1 a 10) de los casos que cambiaron (los otros 12 casos de CP-01 a CP-15 pasaron en todas las corridas; CP-16 a CP-24 se agregaron después y pasaron en todas las suyas)</w:t>
       </w:r>
       <w:r>
         <w:t>:</w:t>
@@ -7535,6 +9608,15 @@
         </w:tc>
       </w:tr>
     </w:tbl>
+    <w:p>
+      <w:pPr>
+        <w:spacing w:before="200"/>
+        <w:jc w:val="both"/>
+      </w:pPr>
+      <w:r>
+        <w:t>En las corridas 11 a 16, CP-02 y CP-06 pasaron en todas. CP-15 falló en las corridas 13, 14 y 15 al borrar su PDF temporal, por un defecto de la propia prueba (OBS-08), y pasó en las corridas 11, 12 y 16.</w:t>
+      </w:r>
+    </w:p>
     <w:p/>
     <w:p>
       <w:pPr>
@@ -7548,10 +9630,16 @@
         <w:t xml:space="preserve">Resultado final: </w:t>
       </w:r>
       <w:r>
-        <w:t>19 de 19 casos aprobados (100 %) en la corrida 10, y 15 de 15 en las corridas 3, 4, 5, 7, 8 y 9 (</w:t>
+        <w:t>24 de 24 casos aprobados (100 %) en la corrida 16. Antes: 23 de 23 en la corrida 12, 19 de 19 en las corridas 10 y 11, y 15 de 15 en las corridas 3, 4, 5, 7, 8 y 9. Las corridas 6, 13, 14 y 15 tuvieron un fallo de CP-15 al borrar su PDF temporal, causado por la propia prueba (OBS-08)</w:t>
       </w:r>
       <w:r>
-        <w:t>la corrida 6 dio 14/15 por un fallo del entorno en CP-15, ajeno al sistema). Cada corrida dura unos 15 segundos y se puede repetir.</w:t>
+        <w:t xml:space="preserve">. </w:t>
+      </w:r>
+      <w:r>
+        <w:t>Cada corrida dura entre 15 y 30 segundos</w:t>
+      </w:r>
+      <w:r>
+        <w:t xml:space="preserve"> y se puede repetir.</w:t>
       </w:r>
     </w:p>
     <w:p>
@@ -7657,6 +9745,34 @@
     </w:p>
     <w:p>
       <w:pPr>
+        <w:jc w:val="both"/>
+      </w:pPr>
+      <w:r>
+        <w:rPr>
+          <w:b/>
+        </w:rPr>
+        <w:t>Verificaciones adicionales (corrida 12):</w:t>
+      </w:r>
+      <w:r>
+        <w:t xml:space="preserve"> se revisó cómo elige los lotes el controlador de ventas: ordena por fecha de vencimiento, deja al final los lotes sin vencimiento, desempata por orden de ingreso y excluye los vencidos. Las cinco reglas ya se cumplían; CP-20 a CP-23 lo dejan demostrado.</w:t>
+      </w:r>
+    </w:p>
+    <w:p>
+      <w:pPr>
+        <w:jc w:val="both"/>
+      </w:pPr>
+      <w:r>
+        <w:rPr>
+          <w:b/>
+        </w:rPr>
+        <w:t>Verificaciones adicionales (corridas 13 a 16):</w:t>
+      </w:r>
+      <w:r>
+        <w:t xml:space="preserve"> un programa aparte confirmó la causa de OBS-08: leído por su ruta con OpenPDF, el PDF no se puede borrar después de cerrar el lector; leído desde sus bytes, sí. El sistema no tenía el defecto: el exportador cierra el archivo.</w:t>
+      </w:r>
+    </w:p>
+    <w:p>
+      <w:pPr>
         <w:pStyle w:val="Ttulo2"/>
       </w:pPr>
       <w:r>
@@ -9049,6 +11165,9 @@
         <w:tc>
           <w:tcPr>
             <w:tcW w:w="1104" w:type="dxa"/>
+            <w:tcBorders>
+              <w:bottom w:val="single" w:sz="4" w:space="0" w:color="808080"/>
+            </w:tcBorders>
             <w:shd w:val="clear" w:color="auto" w:fill="auto"/>
             <w:tcMar>
               <w:top w:w="60" w:type="dxa"/>
@@ -9076,6 +11195,341 @@
                 <w:szCs w:val="20"/>
               </w:rPr>
               <w:t>CAM-02</w:t>
+            </w:r>
+          </w:p>
+        </w:tc>
+        <w:tc>
+          <w:tcPr>
+            <w:tcW w:w="903" w:type="dxa"/>
+            <w:tcBorders>
+              <w:bottom w:val="single" w:sz="4" w:space="0" w:color="808080"/>
+            </w:tcBorders>
+            <w:shd w:val="clear" w:color="auto" w:fill="auto"/>
+            <w:tcMar>
+              <w:top w:w="60" w:type="dxa"/>
+              <w:left w:w="80" w:type="dxa"/>
+              <w:bottom w:w="60" w:type="dxa"/>
+              <w:right w:w="80" w:type="dxa"/>
+            </w:tcMar>
+            <w:vAlign w:val="center"/>
+          </w:tcPr>
+          <w:p>
+            <w:pPr>
+              <w:spacing w:after="0" w:line="240" w:lineRule="auto"/>
+              <w:rPr>
+                <w:sz w:val="20"/>
+                <w:szCs w:val="20"/>
+              </w:rPr>
+            </w:pPr>
+            <w:r>
+              <w:rPr>
+                <w:sz w:val="20"/>
+                <w:szCs w:val="20"/>
+              </w:rPr>
+              <w:t>CP-11, CP-16 a CP-19</w:t>
+            </w:r>
+          </w:p>
+        </w:tc>
+        <w:tc>
+          <w:tcPr>
+            <w:tcW w:w="4919" w:type="dxa"/>
+            <w:tcBorders>
+              <w:bottom w:val="single" w:sz="4" w:space="0" w:color="808080"/>
+            </w:tcBorders>
+            <w:shd w:val="clear" w:color="auto" w:fill="auto"/>
+            <w:tcMar>
+              <w:top w:w="60" w:type="dxa"/>
+              <w:left w:w="80" w:type="dxa"/>
+              <w:bottom w:w="60" w:type="dxa"/>
+              <w:right w:w="80" w:type="dxa"/>
+            </w:tcMar>
+            <w:vAlign w:val="center"/>
+          </w:tcPr>
+          <w:p>
+            <w:pPr>
+              <w:spacing w:after="0" w:line="240" w:lineRule="auto"/>
+              <w:rPr>
+                <w:sz w:val="20"/>
+                <w:szCs w:val="20"/>
+              </w:rPr>
+            </w:pPr>
+            <w:r>
+              <w:rPr>
+                <w:sz w:val="20"/>
+                <w:szCs w:val="20"/>
+              </w:rPr>
+              <w:t>Cambio de alcance pedido por el docente, no defecto: el personal puede anular las ventas que registró en su propio turno abierto (antes solo el administrador). El motivo se elige de una lista (con «Otro», detalle obligatorio) y cada anulación queda registrada con usuario, rol, turno, fecha y hora, motivo, detalle y monto. La regla se valida en el controlador</w:t>
+            </w:r>
+          </w:p>
+        </w:tc>
+        <w:tc>
+          <w:tcPr>
+            <w:tcW w:w="1305" w:type="dxa"/>
+            <w:tcBorders>
+              <w:bottom w:val="single" w:sz="4" w:space="0" w:color="808080"/>
+            </w:tcBorders>
+            <w:shd w:val="clear" w:color="auto" w:fill="auto"/>
+            <w:tcMar>
+              <w:top w:w="60" w:type="dxa"/>
+              <w:left w:w="80" w:type="dxa"/>
+              <w:bottom w:w="60" w:type="dxa"/>
+              <w:right w:w="80" w:type="dxa"/>
+            </w:tcMar>
+            <w:vAlign w:val="center"/>
+          </w:tcPr>
+          <w:p>
+            <w:pPr>
+              <w:spacing w:after="0" w:line="240" w:lineRule="auto"/>
+              <w:rPr>
+                <w:sz w:val="20"/>
+                <w:szCs w:val="20"/>
+              </w:rPr>
+            </w:pPr>
+            <w:r>
+              <w:rPr>
+                <w:sz w:val="20"/>
+                <w:szCs w:val="20"/>
+              </w:rPr>
+              <w:t>—</w:t>
+            </w:r>
+          </w:p>
+        </w:tc>
+        <w:tc>
+          <w:tcPr>
+            <w:tcW w:w="1809" w:type="dxa"/>
+            <w:tcBorders>
+              <w:bottom w:val="single" w:sz="4" w:space="0" w:color="808080"/>
+            </w:tcBorders>
+            <w:shd w:val="clear" w:color="auto" w:fill="auto"/>
+            <w:tcMar>
+              <w:top w:w="60" w:type="dxa"/>
+              <w:left w:w="80" w:type="dxa"/>
+              <w:bottom w:w="60" w:type="dxa"/>
+              <w:right w:w="80" w:type="dxa"/>
+            </w:tcMar>
+            <w:vAlign w:val="center"/>
+          </w:tcPr>
+          <w:p>
+            <w:pPr>
+              <w:spacing w:after="0" w:line="240" w:lineRule="auto"/>
+              <w:rPr>
+                <w:sz w:val="20"/>
+                <w:szCs w:val="20"/>
+              </w:rPr>
+            </w:pPr>
+            <w:r>
+              <w:rPr>
+                <w:sz w:val="20"/>
+                <w:szCs w:val="20"/>
+              </w:rPr>
+              <w:t>Aplicado y verificado (corrida 10)</w:t>
+            </w:r>
+          </w:p>
+        </w:tc>
+      </w:tr>
+      <w:tr>
+        <w:trPr>
+          <w:cantSplit/>
+        </w:trPr>
+        <w:tc>
+          <w:tcPr>
+            <w:tcW w:w="1104" w:type="dxa"/>
+            <w:tcBorders>
+              <w:bottom w:val="single" w:sz="4" w:space="0" w:color="808080"/>
+            </w:tcBorders>
+            <w:shd w:val="clear" w:color="auto" w:fill="F2F2F2"/>
+            <w:tcMar>
+              <w:top w:w="60" w:type="dxa"/>
+              <w:left w:w="80" w:type="dxa"/>
+              <w:bottom w:w="60" w:type="dxa"/>
+              <w:right w:w="80" w:type="dxa"/>
+            </w:tcMar>
+            <w:vAlign w:val="center"/>
+          </w:tcPr>
+          <w:p>
+            <w:pPr>
+              <w:spacing w:after="0" w:line="240" w:lineRule="auto"/>
+              <w:rPr>
+                <w:b/>
+                <w:bCs/>
+                <w:sz w:val="20"/>
+                <w:szCs w:val="20"/>
+              </w:rPr>
+            </w:pPr>
+            <w:r>
+              <w:rPr>
+                <w:b/>
+                <w:bCs/>
+                <w:sz w:val="20"/>
+                <w:szCs w:val="20"/>
+              </w:rPr>
+              <w:t>OBS-07</w:t>
+            </w:r>
+          </w:p>
+        </w:tc>
+        <w:tc>
+          <w:tcPr>
+            <w:tcW w:w="903" w:type="dxa"/>
+            <w:tcBorders>
+              <w:bottom w:val="single" w:sz="4" w:space="0" w:color="808080"/>
+            </w:tcBorders>
+            <w:shd w:val="clear" w:color="auto" w:fill="F2F2F2"/>
+            <w:tcMar>
+              <w:top w:w="60" w:type="dxa"/>
+              <w:left w:w="80" w:type="dxa"/>
+              <w:bottom w:w="60" w:type="dxa"/>
+              <w:right w:w="80" w:type="dxa"/>
+            </w:tcMar>
+            <w:vAlign w:val="center"/>
+          </w:tcPr>
+          <w:p>
+            <w:pPr>
+              <w:spacing w:after="0" w:line="240" w:lineRule="auto"/>
+              <w:rPr>
+                <w:sz w:val="20"/>
+                <w:szCs w:val="20"/>
+              </w:rPr>
+            </w:pPr>
+            <w:r>
+              <w:rPr>
+                <w:sz w:val="20"/>
+                <w:szCs w:val="20"/>
+              </w:rPr>
+              <w:t>CP-24</w:t>
+            </w:r>
+          </w:p>
+        </w:tc>
+        <w:tc>
+          <w:tcPr>
+            <w:tcW w:w="4919" w:type="dxa"/>
+            <w:tcBorders>
+              <w:bottom w:val="single" w:sz="4" w:space="0" w:color="808080"/>
+            </w:tcBorders>
+            <w:shd w:val="clear" w:color="auto" w:fill="F2F2F2"/>
+            <w:tcMar>
+              <w:top w:w="60" w:type="dxa"/>
+              <w:left w:w="80" w:type="dxa"/>
+              <w:bottom w:w="60" w:type="dxa"/>
+              <w:right w:w="80" w:type="dxa"/>
+            </w:tcMar>
+            <w:vAlign w:val="center"/>
+          </w:tcPr>
+          <w:p>
+            <w:pPr>
+              <w:spacing w:after="0" w:line="240" w:lineRule="auto"/>
+              <w:rPr>
+                <w:sz w:val="20"/>
+                <w:szCs w:val="20"/>
+              </w:rPr>
+            </w:pPr>
+            <w:r>
+              <w:rPr>
+                <w:sz w:val="20"/>
+                <w:szCs w:val="20"/>
+              </w:rPr>
+              <w:t>La recepción de lotes vencidos se impedía solo en la pantalla: el controlador aceptaba un lote vencido si se lo llamaba directamente. Ahora el controlador rechaza la guía completa antes de grabar nada</w:t>
+            </w:r>
+          </w:p>
+        </w:tc>
+        <w:tc>
+          <w:tcPr>
+            <w:tcW w:w="1305" w:type="dxa"/>
+            <w:tcBorders>
+              <w:bottom w:val="single" w:sz="4" w:space="0" w:color="808080"/>
+            </w:tcBorders>
+            <w:shd w:val="clear" w:color="auto" w:fill="F2F2F2"/>
+            <w:tcMar>
+              <w:top w:w="60" w:type="dxa"/>
+              <w:left w:w="80" w:type="dxa"/>
+              <w:bottom w:w="60" w:type="dxa"/>
+              <w:right w:w="80" w:type="dxa"/>
+            </w:tcMar>
+            <w:vAlign w:val="center"/>
+          </w:tcPr>
+          <w:p>
+            <w:pPr>
+              <w:spacing w:after="0" w:line="240" w:lineRule="auto"/>
+              <w:rPr>
+                <w:sz w:val="20"/>
+                <w:szCs w:val="20"/>
+              </w:rPr>
+            </w:pPr>
+            <w:r>
+              <w:rPr>
+                <w:sz w:val="20"/>
+                <w:szCs w:val="20"/>
+              </w:rPr>
+              <w:t>Baja</w:t>
+            </w:r>
+          </w:p>
+        </w:tc>
+        <w:tc>
+          <w:tcPr>
+            <w:tcW w:w="1809" w:type="dxa"/>
+            <w:tcBorders>
+              <w:bottom w:val="single" w:sz="4" w:space="0" w:color="808080"/>
+            </w:tcBorders>
+            <w:shd w:val="clear" w:color="auto" w:fill="F2F2F2"/>
+            <w:tcMar>
+              <w:top w:w="60" w:type="dxa"/>
+              <w:left w:w="80" w:type="dxa"/>
+              <w:bottom w:w="60" w:type="dxa"/>
+              <w:right w:w="80" w:type="dxa"/>
+            </w:tcMar>
+            <w:vAlign w:val="center"/>
+          </w:tcPr>
+          <w:p>
+            <w:pPr>
+              <w:spacing w:after="0" w:line="240" w:lineRule="auto"/>
+              <w:rPr>
+                <w:sz w:val="20"/>
+                <w:szCs w:val="20"/>
+              </w:rPr>
+            </w:pPr>
+            <w:r>
+              <w:rPr>
+                <w:sz w:val="20"/>
+                <w:szCs w:val="20"/>
+              </w:rPr>
+              <w:t>Corregido y verificado (corrida 16)</w:t>
+            </w:r>
+          </w:p>
+        </w:tc>
+      </w:tr>
+      <w:tr>
+        <w:trPr>
+          <w:cantSplit/>
+        </w:trPr>
+        <w:tc>
+          <w:tcPr>
+            <w:tcW w:w="1104" w:type="dxa"/>
+            <w:shd w:val="clear" w:color="auto" w:fill="auto"/>
+            <w:tcMar>
+              <w:top w:w="60" w:type="dxa"/>
+              <w:left w:w="80" w:type="dxa"/>
+              <w:bottom w:w="60" w:type="dxa"/>
+              <w:right w:w="80" w:type="dxa"/>
+            </w:tcMar>
+            <w:vAlign w:val="center"/>
+          </w:tcPr>
+          <w:p>
+            <w:pPr>
+              <w:spacing w:after="0" w:line="240" w:lineRule="auto"/>
+              <w:rPr>
+                <w:b/>
+                <w:bCs/>
+                <w:sz w:val="20"/>
+                <w:szCs w:val="20"/>
+              </w:rPr>
+            </w:pPr>
+            <w:r>
+              <w:rPr>
+                <w:b/>
+                <w:bCs/>
+                <w:sz w:val="20"/>
+                <w:szCs w:val="20"/>
+              </w:rPr>
+              <w:t>OBS-08</w:t>
             </w:r>
           </w:p>
         </w:tc>
@@ -9104,7 +11558,7 @@
                 <w:sz w:val="20"/>
                 <w:szCs w:val="20"/>
               </w:rPr>
-              <w:t>CP-11, CP-16 a CP-19</w:t>
+              <w:t>CP-15</w:t>
             </w:r>
           </w:p>
         </w:tc>
@@ -9133,7 +11587,7 @@
                 <w:sz w:val="20"/>
                 <w:szCs w:val="20"/>
               </w:rPr>
-              <w:t>Cambio de alcance pedido por el docente, no defecto: el personal puede anular las ventas que registró en su propio turno abierto (antes solo el administrador). El motivo se elige de una lista (con «Otro», detalle obligatorio) y cada anulación queda registrada con usuario, rol, turno, fecha y hora, motivo, detalle y monto. La regla se valida en el controlador</w:t>
+              <w:t>Fallo intermitente de CP-15 al borrar su PDF temporal, antes atribuido a otro proceso de Windows. La causa era la propia prueba: leía el PDF por su ruta y OpenPDF lo mapeaba en memoria. Ahora lo lee desde sus bytes. Defecto de la prueba, no del sistema</w:t>
             </w:r>
           </w:p>
         </w:tc>
@@ -9162,7 +11616,7 @@
                 <w:sz w:val="20"/>
                 <w:szCs w:val="20"/>
               </w:rPr>
-              <w:t>—</w:t>
+              <w:t>Baja</w:t>
             </w:r>
           </w:p>
         </w:tc>
@@ -9191,7 +11645,7 @@
                 <w:sz w:val="20"/>
                 <w:szCs w:val="20"/>
               </w:rPr>
-              <w:t>Aplicado y verificado (corrida 10)</w:t>
+              <w:t>Corregido y verificado (corrida 16)</w:t>
             </w:r>
           </w:p>
         </w:tc>
@@ -9206,7 +11660,10 @@
         <w:t xml:space="preserve">OBS-02 a OBS-05 se encontraron al revisar el código para escribir los manuales de usuario, no con los casos automatizados. CAM-01 no es un defecto, sino un cambio de alcance decidido por el equipo: el sistema solo registra la forma de pago. </w:t>
       </w:r>
       <w:r>
-        <w:t>OBS-06 atiende la recomendación de guardar las contraseñas con hash. CAM-02 también es un cambio de alcance, pedido por el docente: el personal anula las ventas de su propio turno, con registro del motivo.</w:t>
+        <w:t xml:space="preserve">OBS-06 atiende la recomendación de guardar las contraseñas con hash. CAM-02 también es un cambio de alcance, pedido por el docente: el personal anula las ventas de su propio turno, </w:t>
+      </w:r>
+      <w:r>
+        <w:t>con registro del motivo. OBS-07 se encontró al revisar el orden de salida de los lotes, y OBS-08 es un defecto de la prueba CP-15, no del sistema.</w:t>
       </w:r>
       <w:r>
         <w:t xml:space="preserve"> Limitaciones conocidas que se dejan documentadas:</w:t>
@@ -9276,7 +11733,7 @@
         <w:t xml:space="preserve">Los procesos centrales cumplen las reglas de negocio del documento: los 15 casos aprueban </w:t>
       </w:r>
       <w:r>
-        <w:t>en las corridas 3, 4, 5, 7, 8 y 9, y los 19 en la corrida 10.</w:t>
+        <w:t>en las corridas 3, 4, 5, 7, 8 y 9, los 19 en las corridas 10 y 11, los 23 en la 12 y los 24 en la 16.</w:t>
       </w:r>
     </w:p>
     <w:p>
@@ -9395,6 +11852,34 @@
       </w:pPr>
       <w:r>
         <w:t>El personal anula las ventas de su propio turno abierto, con motivo obligatorio y registro de cada anulación (CAM-02); la regla se valida en el controlador y la corrida 10 confirmó que los 19 casos aprueban.</w:t>
+      </w:r>
+    </w:p>
+    <w:p>
+      <w:pPr>
+        <w:pStyle w:val="Prrafodelista"/>
+        <w:numPr>
+          <w:ilvl w:val="0"/>
+          <w:numId w:val="1"/>
+        </w:numPr>
+        <w:spacing w:after="60"/>
+        <w:jc w:val="both"/>
+      </w:pPr>
+      <w:r>
+        <w:t>Las ventas respetan el orden de salida de los lotes (vencimiento, orden de ingreso, sin vencidos y con cada lote registrado), y desde la corrida 13 el controlador tampoco recibe lotes vencidos (OBS-07).</w:t>
+      </w:r>
+    </w:p>
+    <w:p>
+      <w:pPr>
+        <w:pStyle w:val="Prrafodelista"/>
+        <w:numPr>
+          <w:ilvl w:val="0"/>
+          <w:numId w:val="1"/>
+        </w:numPr>
+        <w:spacing w:after="60"/>
+        <w:jc w:val="both"/>
+      </w:pPr>
+      <w:r>
+        <w:t>El fallo intermitente de CP-15 no era del entorno sino de la propia prueba (OBS-08); se corrigió y la corrida 16 dio 24/24.</w:t>
       </w:r>
     </w:p>
     <w:p>

</xml_diff>